<commit_message>
Sexta Versão - Parte 01
</commit_message>
<xml_diff>
--- a/docs/conceitos_componentes_para_o_site.docx
+++ b/docs/conceitos_componentes_para_o_site.docx
@@ -1,6 +1,6 @@
 
 <file path=word/document.xml><?xml version="1.0" encoding="utf-8"?>
-<w:document xmlns:wpc="http://schemas.microsoft.com/office/word/2010/wordprocessingCanvas" xmlns:cx="http://schemas.microsoft.com/office/drawing/2014/chartex" xmlns:cx1="http://schemas.microsoft.com/office/drawing/2015/9/8/chartex" xmlns:cx2="http://schemas.microsoft.com/office/drawing/2015/10/21/chartex" xmlns:cx3="http://schemas.microsoft.com/office/drawing/2016/5/9/chartex" xmlns:cx4="http://schemas.microsoft.com/office/drawing/2016/5/10/chartex" xmlns:cx5="http://schemas.microsoft.com/office/drawing/2016/5/11/chartex" xmlns:cx6="http://schemas.microsoft.com/office/drawing/2016/5/12/chartex" xmlns:cx7="http://schemas.microsoft.com/office/drawing/2016/5/13/chartex" xmlns:cx8="http://schemas.microsoft.com/office/drawing/2016/5/14/chartex" xmlns:mc="http://schemas.openxmlformats.org/markup-compatibility/2006" xmlns:aink="http://schemas.microsoft.com/office/drawing/2016/ink" xmlns:am3d="http://schemas.microsoft.com/office/drawing/2017/model3d" xmlns:o="urn:schemas-microsoft-com:office:office" xmlns:oel="http://schemas.microsoft.com/office/2019/extlst" xmlns:r="http://schemas.openxmlformats.org/officeDocument/2006/relationships" xmlns:m="http://schemas.openxmlformats.org/officeDocument/2006/math" xmlns:v="urn:schemas-microsoft-com:vml" xmlns:wp14="http://schemas.microsoft.com/office/word/2010/wordprocessingDrawing" xmlns:wp="http://schemas.openxmlformats.org/drawingml/2006/wordprocessingDrawing" xmlns:w10="urn:schemas-microsoft-com:office:word" xmlns:w="http://schemas.openxmlformats.org/wordprocessingml/2006/main" xmlns:w14="http://schemas.microsoft.com/office/word/2010/wordml" xmlns:w15="http://schemas.microsoft.com/office/word/2012/wordml" xmlns:w16cex="http://schemas.microsoft.com/office/word/2018/wordml/cex" xmlns:w16cid="http://schemas.microsoft.com/office/word/2016/wordml/cid" xmlns:w16="http://schemas.microsoft.com/office/word/2018/wordml" xmlns:w16du="http://schemas.microsoft.com/office/word/2023/wordml/word16du" xmlns:w16sdtdh="http://schemas.microsoft.com/office/word/2020/wordml/sdtdatahash" xmlns:w16sdtfl="http://schemas.microsoft.com/office/word/2024/wordml/sdtformatlock" xmlns:w16se="http://schemas.microsoft.com/office/word/2015/wordml/symex" xmlns:wpg="http://schemas.microsoft.com/office/word/2010/wordprocessingGroup" xmlns:wpi="http://schemas.microsoft.com/office/word/2010/wordprocessingInk" xmlns:wne="http://schemas.microsoft.com/office/word/2006/wordml" xmlns:wps="http://schemas.microsoft.com/office/word/2010/wordprocessingShape" mc:Ignorable="w14 w15 w16se w16cid w16 w16cex w16sdtdh w16sdtfl w16du wp14">
+<w:document xmlns:wpc="http://schemas.microsoft.com/office/word/2010/wordprocessingCanvas" xmlns:cx="http://schemas.microsoft.com/office/drawing/2014/chartex" xmlns:cx1="http://schemas.microsoft.com/office/drawing/2015/9/8/chartex" xmlns:cx2="http://schemas.microsoft.com/office/drawing/2015/10/21/chartex" xmlns:cx3="http://schemas.microsoft.com/office/drawing/2016/5/9/chartex" xmlns:cx4="http://schemas.microsoft.com/office/drawing/2016/5/10/chartex" xmlns:cx5="http://schemas.microsoft.com/office/drawing/2016/5/11/chartex" xmlns:cx6="http://schemas.microsoft.com/office/drawing/2016/5/12/chartex" xmlns:cx7="http://schemas.microsoft.com/office/drawing/2016/5/13/chartex" xmlns:cx8="http://schemas.microsoft.com/office/drawing/2016/5/14/chartex" xmlns:mc="http://schemas.openxmlformats.org/markup-compatibility/2006" xmlns:aink="http://schemas.microsoft.com/office/drawing/2016/ink" xmlns:am3d="http://schemas.microsoft.com/office/drawing/2017/model3d" xmlns:o="urn:schemas-microsoft-com:office:office" xmlns:oel="http://schemas.microsoft.com/office/2019/extlst" xmlns:r="http://schemas.openxmlformats.org/officeDocument/2006/relationships" xmlns:m="http://schemas.openxmlformats.org/officeDocument/2006/math" xmlns:v="urn:schemas-microsoft-com:vml" xmlns:wp14="http://schemas.microsoft.com/office/word/2010/wordprocessingDrawing" xmlns:wp="http://schemas.openxmlformats.org/drawingml/2006/wordprocessingDrawing" xmlns:w10="urn:schemas-microsoft-com:office:word" xmlns:w="http://schemas.openxmlformats.org/wordprocessingml/2006/main" xmlns:w14="http://schemas.microsoft.com/office/word/2010/wordml" xmlns:w15="http://schemas.microsoft.com/office/word/2012/wordml" xmlns:w16cex="http://schemas.microsoft.com/office/word/2018/wordml/cex" xmlns:w16cid="http://schemas.microsoft.com/office/word/2016/wordml/cid" xmlns:w16="http://schemas.microsoft.com/office/word/2018/wordml" xmlns:w16sdtdh="http://schemas.microsoft.com/office/word/2020/wordml/sdtdatahash" xmlns:w16se="http://schemas.microsoft.com/office/word/2015/wordml/symex" xmlns:wpg="http://schemas.microsoft.com/office/word/2010/wordprocessingGroup" xmlns:wpi="http://schemas.microsoft.com/office/word/2010/wordprocessingInk" xmlns:wne="http://schemas.microsoft.com/office/word/2006/wordml" xmlns:wps="http://schemas.microsoft.com/office/word/2010/wordprocessingShape" mc:Ignorable="w14 w15 w16se w16cid w16 w16cex w16sdtdh wp14">
   <w:body>
     <w:p>
       <w:pPr>
@@ -220,8 +220,16 @@
           <w:color w:val="2E74B5"/>
           <w:sz w:val="26"/>
         </w:rPr>
-        <w:t>2. Disjuntor</w:t>
+        <w:t xml:space="preserve">2. </w:t>
       </w:r>
+      <w:r>
+        <w:rPr>
+          <w:b/>
+          <w:color w:val="2E74B5"/>
+          <w:sz w:val="26"/>
+        </w:rPr>
+        <w:t>Disjuntor</w:t>
+      </w:r>
     </w:p>
     <w:p>
       <w:pPr>
@@ -240,7 +248,194 @@
         <w:rPr>
           <w:sz w:val="21"/>
         </w:rPr>
-        <w:t>É um dispositivo de proteção termomagnético mecânico. Sua função é monitorar a corrente do circuito e desarmar automaticamente caso detecte uma sobrecarga (excesso de aparelhos ligados por muito tempo) ou um curto-circuito (um pico extremo e perigoso de corrente).</w:t>
+        <w:t xml:space="preserve">É um dispositivo de proteção termomagnético mecânico cuja função é monitorar a corrente do circuito e desarmar automaticamente caso detecte uma sobrecarga ou um curto-circuito. A diferença entre </w:t>
+      </w:r>
+      <w:r>
+        <w:rPr>
+          <w:sz w:val="21"/>
+        </w:rPr>
+        <w:t>su</w:t>
+      </w:r>
+      <w:r>
+        <w:rPr>
+          <w:sz w:val="21"/>
+        </w:rPr>
+        <w:t>as versões está na quantidade de fases (p</w:t>
+      </w:r>
+      <w:r>
+        <w:rPr>
+          <w:sz w:val="21"/>
+        </w:rPr>
+        <w:t>o</w:t>
+      </w:r>
+      <w:r>
+        <w:rPr>
+          <w:sz w:val="21"/>
+        </w:rPr>
+        <w:t>los) que o dispositivo protege e desliga simultaneamente:</w:t>
+      </w:r>
+    </w:p>
+    <w:p>
+      <w:pPr>
+        <w:spacing w:after="0"/>
+        <w:rPr>
+          <w:sz w:val="21"/>
+        </w:rPr>
+      </w:pPr>
+    </w:p>
+    <w:p>
+      <w:pPr>
+        <w:pStyle w:val="PargrafodaLista"/>
+        <w:numPr>
+          <w:ilvl w:val="0"/>
+          <w:numId w:val="10"/>
+        </w:numPr>
+        <w:spacing w:after="0"/>
+        <w:rPr>
+          <w:sz w:val="21"/>
+        </w:rPr>
+      </w:pPr>
+      <w:r>
+        <w:rPr>
+          <w:b/>
+          <w:bCs/>
+          <w:sz w:val="21"/>
+          <w:u w:val="single"/>
+        </w:rPr>
+        <w:t>Monofásico (1 p</w:t>
+      </w:r>
+      <w:r>
+        <w:rPr>
+          <w:b/>
+          <w:bCs/>
+          <w:sz w:val="21"/>
+          <w:u w:val="single"/>
+        </w:rPr>
+        <w:t>o</w:t>
+      </w:r>
+      <w:r>
+        <w:rPr>
+          <w:b/>
+          <w:bCs/>
+          <w:sz w:val="21"/>
+          <w:u w:val="single"/>
+        </w:rPr>
+        <w:t>lo):</w:t>
+      </w:r>
+      <w:r>
+        <w:rPr>
+          <w:sz w:val="21"/>
+        </w:rPr>
+        <w:t xml:space="preserve"> Monitora e protege apenas uma única fase.</w:t>
+      </w:r>
+    </w:p>
+    <w:p>
+      <w:pPr>
+        <w:spacing w:after="0"/>
+        <w:ind w:left="360"/>
+        <w:rPr>
+          <w:sz w:val="21"/>
+        </w:rPr>
+      </w:pPr>
+    </w:p>
+    <w:p>
+      <w:pPr>
+        <w:pStyle w:val="PargrafodaLista"/>
+        <w:numPr>
+          <w:ilvl w:val="0"/>
+          <w:numId w:val="10"/>
+        </w:numPr>
+        <w:spacing w:after="0"/>
+        <w:rPr>
+          <w:sz w:val="21"/>
+        </w:rPr>
+      </w:pPr>
+      <w:r>
+        <w:rPr>
+          <w:b/>
+          <w:bCs/>
+          <w:sz w:val="21"/>
+          <w:u w:val="single"/>
+        </w:rPr>
+        <w:t>Bifásico (2 p</w:t>
+      </w:r>
+      <w:r>
+        <w:rPr>
+          <w:b/>
+          <w:bCs/>
+          <w:sz w:val="21"/>
+          <w:u w:val="single"/>
+        </w:rPr>
+        <w:t>o</w:t>
+      </w:r>
+      <w:r>
+        <w:rPr>
+          <w:b/>
+          <w:bCs/>
+          <w:sz w:val="21"/>
+          <w:u w:val="single"/>
+        </w:rPr>
+        <w:t>los):</w:t>
+      </w:r>
+      <w:r>
+        <w:rPr>
+          <w:sz w:val="21"/>
+        </w:rPr>
+        <w:t xml:space="preserve"> Monitora duas fases ao mesmo tempo. Possui um mecanismo de disparo unificado: se ocorrer uma falha em uma das fases, o disjuntor desliga ambas as fases juntas por segurança.</w:t>
+      </w:r>
+    </w:p>
+    <w:p>
+      <w:pPr>
+        <w:pStyle w:val="PargrafodaLista"/>
+        <w:rPr>
+          <w:sz w:val="21"/>
+        </w:rPr>
+      </w:pPr>
+    </w:p>
+    <w:p>
+      <w:pPr>
+        <w:pStyle w:val="PargrafodaLista"/>
+        <w:numPr>
+          <w:ilvl w:val="0"/>
+          <w:numId w:val="10"/>
+        </w:numPr>
+        <w:spacing w:after="0"/>
+        <w:rPr>
+          <w:sz w:val="21"/>
+        </w:rPr>
+      </w:pPr>
+      <w:r>
+        <w:rPr>
+          <w:b/>
+          <w:bCs/>
+          <w:sz w:val="21"/>
+          <w:u w:val="single"/>
+        </w:rPr>
+        <w:t>Trifásico (3 p</w:t>
+      </w:r>
+      <w:r>
+        <w:rPr>
+          <w:b/>
+          <w:bCs/>
+          <w:sz w:val="21"/>
+          <w:u w:val="single"/>
+        </w:rPr>
+        <w:t>o</w:t>
+      </w:r>
+      <w:r>
+        <w:rPr>
+          <w:b/>
+          <w:bCs/>
+          <w:sz w:val="21"/>
+          <w:u w:val="single"/>
+        </w:rPr>
+        <w:t>los):</w:t>
+      </w:r>
+      <w:r>
+        <w:rPr>
+          <w:sz w:val="21"/>
+        </w:rPr>
+        <w:t xml:space="preserve"> Monitora três fases simultaneamente. Também possui disparo unificado, sendo crucial para evitar que equipamentos trifásicos queimem ao rodar com a falta de uma das fases.</w:t>
       </w:r>
     </w:p>
     <w:p>
@@ -278,9 +473,18 @@
       </w:pPr>
       <w:r>
         <w:rPr>
+          <w:b/>
+          <w:bCs/>
           <w:sz w:val="21"/>
-        </w:rPr>
-        <w:t>Proteção de cabos e fiações contra superaquecimento e incêndios.</w:t>
+          <w:u w:val="single"/>
+        </w:rPr>
+        <w:t>Monofásico:</w:t>
+      </w:r>
+      <w:r>
+        <w:rPr>
+          <w:sz w:val="21"/>
+        </w:rPr>
+        <w:t xml:space="preserve"> Circuitos elétricos simples e de menor potência, como iluminação e tomadas comuns residenciais.</w:t>
       </w:r>
     </w:p>
     <w:p>
@@ -300,9 +504,40 @@
       </w:pPr>
       <w:r>
         <w:rPr>
+          <w:b/>
+          <w:bCs/>
           <w:sz w:val="21"/>
-        </w:rPr>
-        <w:t>Quadros de distribuição residenciais, comerciais e industriais.</w:t>
+          <w:u w:val="single"/>
+        </w:rPr>
+        <w:t>Bifásico:</w:t>
+      </w:r>
+      <w:r>
+        <w:rPr>
+          <w:sz w:val="21"/>
+        </w:rPr>
+        <w:t xml:space="preserve"> Equipamentos residenciais ou comerciais de média potência, como chuveiros elétricos, sistemas de ar-condicionado e circuitos bifásicos gerais.</w:t>
+      </w:r>
+    </w:p>
+    <w:p>
+      <w:pPr>
+        <w:pStyle w:val="PargrafodaLista"/>
+      </w:pPr>
+    </w:p>
+    <w:p>
+      <w:pPr>
+        <w:pStyle w:val="Commarcadores"/>
+        <w:spacing w:after="0"/>
+      </w:pPr>
+      <w:r>
+        <w:rPr>
+          <w:b/>
+          <w:bCs/>
+          <w:u w:val="single"/>
+        </w:rPr>
+        <w:t>Trifásico:</w:t>
+      </w:r>
+      <w:r>
+        <w:t xml:space="preserve"> Motores elétricos industriais trifásicos, máquinas pesadas e quadros gerais de distribuição industrial ou comercial de alta potência.</w:t>
       </w:r>
     </w:p>
     <w:p>
@@ -398,7 +633,6 @@
           <w:b/>
           <w:sz w:val="21"/>
         </w:rPr>
-        <w:lastRenderedPageBreak/>
         <w:t>Aplicações:</w:t>
       </w:r>
     </w:p>
@@ -506,7 +740,7 @@
         <w:rPr>
           <w:sz w:val="21"/>
         </w:rPr>
-        <w:t>É um botão de comando manual que serve para abrir ou fechar um circuito temporariamente. O tipo mais comum é o pulsador (com mola), que só altera seu estado enquanto estiver sendo pressionado.</w:t>
+        <w:t>É um botão de comando manual que serve para abrir ou fechar um circuito temporariamente, dependendo de seu tipo: Normalmente Aberto (NA), Normalmente Fechado (NF), ou ambos (NA e NF). O tipo mais comum é o pulsador (com mola), que só altera seu estado enquanto estiver sendo pressionado.</w:t>
       </w:r>
     </w:p>
     <w:p>
@@ -544,6 +778,8 @@
       </w:pPr>
       <w:r>
         <w:rPr>
+          <w:b/>
+          <w:bCs/>
           <w:sz w:val="21"/>
           <w:u w:val="single"/>
         </w:rPr>
@@ -553,7 +789,31 @@
         <w:rPr>
           <w:sz w:val="21"/>
         </w:rPr>
-        <w:t xml:space="preserve"> Usada para ligar, dar partida ou arranque em máquinas e motores. Também indica que o sistema está em condições normais de operação.</w:t>
+        <w:t xml:space="preserve"> Usada</w:t>
+      </w:r>
+      <w:r>
+        <w:rPr>
+          <w:sz w:val="21"/>
+        </w:rPr>
+        <w:t>s</w:t>
+      </w:r>
+      <w:r>
+        <w:rPr>
+          <w:sz w:val="21"/>
+        </w:rPr>
+        <w:t xml:space="preserve"> para ligar, dar partida ou arranque em máquinas e motores. Também indica</w:t>
+      </w:r>
+      <w:r>
+        <w:rPr>
+          <w:sz w:val="21"/>
+        </w:rPr>
+        <w:t>m</w:t>
+      </w:r>
+      <w:r>
+        <w:rPr>
+          <w:sz w:val="21"/>
+        </w:rPr>
+        <w:t xml:space="preserve"> que o sistema está em condições normais de operação.</w:t>
       </w:r>
     </w:p>
     <w:p>
@@ -574,6 +834,8 @@
       </w:pPr>
       <w:r>
         <w:rPr>
+          <w:b/>
+          <w:bCs/>
           <w:sz w:val="21"/>
           <w:u w:val="single"/>
         </w:rPr>
@@ -615,6 +877,8 @@
       </w:pPr>
       <w:r>
         <w:rPr>
+          <w:b/>
+          <w:bCs/>
           <w:sz w:val="21"/>
           <w:u w:val="single"/>
         </w:rPr>
@@ -644,6 +908,8 @@
       </w:pPr>
       <w:r>
         <w:rPr>
+          <w:b/>
+          <w:bCs/>
           <w:sz w:val="21"/>
           <w:u w:val="single"/>
         </w:rPr>
@@ -653,7 +919,43 @@
         <w:rPr>
           <w:sz w:val="21"/>
         </w:rPr>
-        <w:t xml:space="preserve"> Destinada a qualquer outra função que não seja ligar, desligar, emergência ou cancelar. É aplicada quando nenhuma das outras cores se encaixa na necessidade do comando.</w:t>
+        <w:t xml:space="preserve"> Destinada</w:t>
+      </w:r>
+      <w:r>
+        <w:rPr>
+          <w:sz w:val="21"/>
+        </w:rPr>
+        <w:t>s</w:t>
+      </w:r>
+      <w:r>
+        <w:rPr>
+          <w:sz w:val="21"/>
+        </w:rPr>
+        <w:t xml:space="preserve"> a qualquer outra função que não seja ligar, desligar, emergência ou cancelar. </w:t>
+      </w:r>
+      <w:r>
+        <w:rPr>
+          <w:sz w:val="21"/>
+        </w:rPr>
+        <w:t>São</w:t>
+      </w:r>
+      <w:r>
+        <w:rPr>
+          <w:sz w:val="21"/>
+        </w:rPr>
+        <w:t xml:space="preserve"> aplicada</w:t>
+      </w:r>
+      <w:r>
+        <w:rPr>
+          <w:sz w:val="21"/>
+        </w:rPr>
+        <w:t>s</w:t>
+      </w:r>
+      <w:r>
+        <w:rPr>
+          <w:sz w:val="21"/>
+        </w:rPr>
+        <w:t xml:space="preserve"> quando nenhuma das outras cores se encaixa na necessidade do comando.</w:t>
       </w:r>
     </w:p>
     <w:p>
@@ -674,9 +976,12 @@
       </w:pPr>
       <w:r>
         <w:rPr>
+          <w:b/>
+          <w:bCs/>
           <w:sz w:val="21"/>
           <w:u w:val="single"/>
         </w:rPr>
+        <w:lastRenderedPageBreak/>
         <w:t>Emergência:</w:t>
       </w:r>
       <w:r>
@@ -1049,6 +1354,7 @@
           <w:b/>
           <w:sz w:val="21"/>
         </w:rPr>
+        <w:lastRenderedPageBreak/>
         <w:t>Aplicações:</w:t>
       </w:r>
     </w:p>
@@ -1423,6 +1729,7 @@
           <w:color w:val="2E74B5"/>
           <w:sz w:val="26"/>
         </w:rPr>
+        <w:lastRenderedPageBreak/>
         <w:t>10. Relé Térmico (ou de Sobrecarga)</w:t>
       </w:r>
     </w:p>
@@ -1484,6 +1791,199 @@
           <w:sz w:val="21"/>
         </w:rPr>
         <w:t>Proteção direta de motores elétricos, sendo montado logo abaixo do contator de potência no painel de comando.</w:t>
+      </w:r>
+    </w:p>
+    <w:p>
+      <w:pPr>
+        <w:pStyle w:val="Commarcadores"/>
+        <w:numPr>
+          <w:ilvl w:val="0"/>
+          <w:numId w:val="0"/>
+        </w:numPr>
+        <w:pBdr>
+          <w:bottom w:val="single" w:sz="6" w:space="1" w:color="auto"/>
+        </w:pBdr>
+        <w:spacing w:after="0"/>
+        <w:rPr>
+          <w:sz w:val="21"/>
+        </w:rPr>
+      </w:pPr>
+    </w:p>
+    <w:p>
+      <w:pPr>
+        <w:pStyle w:val="Commarcadores"/>
+        <w:numPr>
+          <w:ilvl w:val="0"/>
+          <w:numId w:val="0"/>
+        </w:numPr>
+        <w:spacing w:after="0"/>
+        <w:rPr>
+          <w:sz w:val="21"/>
+        </w:rPr>
+      </w:pPr>
+    </w:p>
+    <w:p>
+      <w:pPr>
+        <w:keepNext/>
+        <w:spacing w:after="0"/>
+        <w:rPr>
+          <w:b/>
+          <w:color w:val="2E74B5"/>
+          <w:sz w:val="26"/>
+        </w:rPr>
+      </w:pPr>
+      <w:r>
+        <w:rPr>
+          <w:b/>
+          <w:color w:val="2E74B5"/>
+          <w:sz w:val="26"/>
+        </w:rPr>
+        <w:t>11. CLP (Controlador Lógico Programável)</w:t>
+      </w:r>
+      <w:r>
+        <w:rPr>
+          <w:b/>
+          <w:color w:val="2E74B5"/>
+          <w:sz w:val="26"/>
+        </w:rPr>
+        <w:t xml:space="preserve"> / </w:t>
+      </w:r>
+      <w:r>
+        <w:rPr>
+          <w:b/>
+          <w:color w:val="2E74B5"/>
+          <w:sz w:val="26"/>
+        </w:rPr>
+        <w:t>PLC (Programmable Logic Controller)</w:t>
+      </w:r>
+    </w:p>
+    <w:p>
+      <w:pPr>
+        <w:keepNext/>
+        <w:spacing w:after="0"/>
+      </w:pPr>
+    </w:p>
+    <w:p>
+      <w:pPr>
+        <w:spacing w:after="0"/>
+        <w:rPr>
+          <w:sz w:val="21"/>
+        </w:rPr>
+      </w:pPr>
+      <w:r>
+        <w:rPr>
+          <w:sz w:val="21"/>
+        </w:rPr>
+        <w:t xml:space="preserve">É o "cérebro" da automação industrial. Trata-se de um computador robusto projetado especificamente para comandar e monitorar máquinas </w:t>
+      </w:r>
+      <w:r>
+        <w:rPr>
+          <w:sz w:val="21"/>
+        </w:rPr>
+        <w:t>e/</w:t>
+      </w:r>
+      <w:r>
+        <w:rPr>
+          <w:sz w:val="21"/>
+        </w:rPr>
+        <w:t>ou processos em ambientes industriais, recebendo sinais de dispositivos de entrada (como sensores e botoeiras), processando essas informações através de um programa lógico e enviando comandos precisos para os dispositivos de saída (como motores e contatores).</w:t>
+      </w:r>
+    </w:p>
+    <w:p>
+      <w:pPr>
+        <w:spacing w:after="0"/>
+      </w:pPr>
+    </w:p>
+    <w:p>
+      <w:pPr>
+        <w:keepNext/>
+        <w:spacing w:after="0"/>
+        <w:rPr>
+          <w:b/>
+          <w:sz w:val="21"/>
+        </w:rPr>
+      </w:pPr>
+      <w:r>
+        <w:rPr>
+          <w:b/>
+          <w:sz w:val="21"/>
+        </w:rPr>
+        <w:t>Aplicações:</w:t>
+      </w:r>
+    </w:p>
+    <w:p>
+      <w:pPr>
+        <w:keepNext/>
+        <w:spacing w:after="0"/>
+      </w:pPr>
+    </w:p>
+    <w:p>
+      <w:pPr>
+        <w:pStyle w:val="Commarcadores"/>
+        <w:spacing w:after="0"/>
+      </w:pPr>
+      <w:r>
+        <w:rPr>
+          <w:sz w:val="21"/>
+        </w:rPr>
+        <w:t>Controle, automação e sincronização de linhas de montagem e esteiras transportadoras.</w:t>
+      </w:r>
+    </w:p>
+    <w:p>
+      <w:pPr>
+        <w:pStyle w:val="Commarcadores"/>
+        <w:numPr>
+          <w:ilvl w:val="0"/>
+          <w:numId w:val="0"/>
+        </w:numPr>
+        <w:spacing w:after="0"/>
+      </w:pPr>
+    </w:p>
+    <w:p>
+      <w:pPr>
+        <w:pStyle w:val="Commarcadores"/>
+        <w:spacing w:after="0"/>
+      </w:pPr>
+      <w:r>
+        <w:t>Gerenciamento de processos industriais (controle de temperatura, vazão, nível e pressão).</w:t>
+      </w:r>
+    </w:p>
+    <w:p>
+      <w:pPr>
+        <w:pStyle w:val="Commarcadores"/>
+        <w:numPr>
+          <w:ilvl w:val="0"/>
+          <w:numId w:val="0"/>
+        </w:numPr>
+        <w:spacing w:after="0"/>
+      </w:pPr>
+    </w:p>
+    <w:p>
+      <w:pPr>
+        <w:pStyle w:val="Commarcadores"/>
+        <w:spacing w:after="0"/>
+      </w:pPr>
+      <w:r>
+        <w:t>Automação de máquinas de envase, injetoras de plástico e sistemas robóticos.</w:t>
+      </w:r>
+    </w:p>
+    <w:p>
+      <w:pPr>
+        <w:pStyle w:val="Commarcadores"/>
+        <w:numPr>
+          <w:ilvl w:val="0"/>
+          <w:numId w:val="0"/>
+        </w:numPr>
+        <w:spacing w:after="0"/>
+      </w:pPr>
+    </w:p>
+    <w:p>
+      <w:pPr>
+        <w:pStyle w:val="Commarcadores"/>
+        <w:spacing w:after="0"/>
+      </w:pPr>
+      <w:r>
+        <w:t>Controle de infraestruturas como sistemas de bombeamento de água, elevadores e semáforos inteligentes.</w:t>
       </w:r>
     </w:p>
     <w:sectPr>
@@ -1497,7 +1997,7 @@
 </file>
 
 <file path=word/numbering.xml><?xml version="1.0" encoding="utf-8"?>
-<w:numbering xmlns:wpc="http://schemas.microsoft.com/office/word/2010/wordprocessingCanvas" xmlns:cx="http://schemas.microsoft.com/office/drawing/2014/chartex" xmlns:cx1="http://schemas.microsoft.com/office/drawing/2015/9/8/chartex" xmlns:cx2="http://schemas.microsoft.com/office/drawing/2015/10/21/chartex" xmlns:cx3="http://schemas.microsoft.com/office/drawing/2016/5/9/chartex" xmlns:cx4="http://schemas.microsoft.com/office/drawing/2016/5/10/chartex" xmlns:cx5="http://schemas.microsoft.com/office/drawing/2016/5/11/chartex" xmlns:cx6="http://schemas.microsoft.com/office/drawing/2016/5/12/chartex" xmlns:cx7="http://schemas.microsoft.com/office/drawing/2016/5/13/chartex" xmlns:cx8="http://schemas.microsoft.com/office/drawing/2016/5/14/chartex" xmlns:mc="http://schemas.openxmlformats.org/markup-compatibility/2006" xmlns:aink="http://schemas.microsoft.com/office/drawing/2016/ink" xmlns:am3d="http://schemas.microsoft.com/office/drawing/2017/model3d" xmlns:o="urn:schemas-microsoft-com:office:office" xmlns:oel="http://schemas.microsoft.com/office/2019/extlst" xmlns:r="http://schemas.openxmlformats.org/officeDocument/2006/relationships" xmlns:m="http://schemas.openxmlformats.org/officeDocument/2006/math" xmlns:v="urn:schemas-microsoft-com:vml" xmlns:wp14="http://schemas.microsoft.com/office/word/2010/wordprocessingDrawing" xmlns:wp="http://schemas.openxmlformats.org/drawingml/2006/wordprocessingDrawing" xmlns:w10="urn:schemas-microsoft-com:office:word" xmlns:w="http://schemas.openxmlformats.org/wordprocessingml/2006/main" xmlns:w14="http://schemas.microsoft.com/office/word/2010/wordml" xmlns:w15="http://schemas.microsoft.com/office/word/2012/wordml" xmlns:w16cex="http://schemas.microsoft.com/office/word/2018/wordml/cex" xmlns:w16cid="http://schemas.microsoft.com/office/word/2016/wordml/cid" xmlns:w16="http://schemas.microsoft.com/office/word/2018/wordml" xmlns:w16du="http://schemas.microsoft.com/office/word/2023/wordml/word16du" xmlns:w16sdtdh="http://schemas.microsoft.com/office/word/2020/wordml/sdtdatahash" xmlns:w16sdtfl="http://schemas.microsoft.com/office/word/2024/wordml/sdtformatlock" xmlns:w16se="http://schemas.microsoft.com/office/word/2015/wordml/symex" xmlns:wpg="http://schemas.microsoft.com/office/word/2010/wordprocessingGroup" xmlns:wpi="http://schemas.microsoft.com/office/word/2010/wordprocessingInk" xmlns:wne="http://schemas.microsoft.com/office/word/2006/wordml" xmlns:wps="http://schemas.microsoft.com/office/word/2010/wordprocessingShape" mc:Ignorable="w14 w15 w16se w16cid w16 w16cex w16sdtdh w16sdtfl w16du wp14">
+<w:numbering xmlns:wpc="http://schemas.microsoft.com/office/word/2010/wordprocessingCanvas" xmlns:cx="http://schemas.microsoft.com/office/drawing/2014/chartex" xmlns:cx1="http://schemas.microsoft.com/office/drawing/2015/9/8/chartex" xmlns:cx2="http://schemas.microsoft.com/office/drawing/2015/10/21/chartex" xmlns:cx3="http://schemas.microsoft.com/office/drawing/2016/5/9/chartex" xmlns:cx4="http://schemas.microsoft.com/office/drawing/2016/5/10/chartex" xmlns:cx5="http://schemas.microsoft.com/office/drawing/2016/5/11/chartex" xmlns:cx6="http://schemas.microsoft.com/office/drawing/2016/5/12/chartex" xmlns:cx7="http://schemas.microsoft.com/office/drawing/2016/5/13/chartex" xmlns:cx8="http://schemas.microsoft.com/office/drawing/2016/5/14/chartex" xmlns:mc="http://schemas.openxmlformats.org/markup-compatibility/2006" xmlns:aink="http://schemas.microsoft.com/office/drawing/2016/ink" xmlns:am3d="http://schemas.microsoft.com/office/drawing/2017/model3d" xmlns:o="urn:schemas-microsoft-com:office:office" xmlns:oel="http://schemas.microsoft.com/office/2019/extlst" xmlns:r="http://schemas.openxmlformats.org/officeDocument/2006/relationships" xmlns:m="http://schemas.openxmlformats.org/officeDocument/2006/math" xmlns:v="urn:schemas-microsoft-com:vml" xmlns:wp14="http://schemas.microsoft.com/office/word/2010/wordprocessingDrawing" xmlns:wp="http://schemas.openxmlformats.org/drawingml/2006/wordprocessingDrawing" xmlns:w10="urn:schemas-microsoft-com:office:word" xmlns:w="http://schemas.openxmlformats.org/wordprocessingml/2006/main" xmlns:w14="http://schemas.microsoft.com/office/word/2010/wordml" xmlns:w15="http://schemas.microsoft.com/office/word/2012/wordml" xmlns:w16cex="http://schemas.microsoft.com/office/word/2018/wordml/cex" xmlns:w16cid="http://schemas.microsoft.com/office/word/2016/wordml/cid" xmlns:w16="http://schemas.microsoft.com/office/word/2018/wordml" xmlns:w16sdtdh="http://schemas.microsoft.com/office/word/2020/wordml/sdtdatahash" xmlns:w16se="http://schemas.microsoft.com/office/word/2015/wordml/symex" xmlns:wpg="http://schemas.microsoft.com/office/word/2010/wordprocessingGroup" xmlns:wpi="http://schemas.microsoft.com/office/word/2010/wordprocessingInk" xmlns:wne="http://schemas.microsoft.com/office/word/2006/wordml" xmlns:wps="http://schemas.microsoft.com/office/word/2010/wordprocessingShape" mc:Ignorable="w14 w15 w16se w16cid w16 w16cex w16sdtdh wp14">
   <w:abstractNum w:abstractNumId="0" w15:restartNumberingAfterBreak="0">
     <w:nsid w:val="FFFFFF7C"/>
     <w:multiLevelType w:val="singleLevel"/>
@@ -1651,7 +2151,7 @@
   <w:abstractNum w:abstractNumId="8" w15:restartNumberingAfterBreak="0">
     <w:nsid w:val="FFFFFF89"/>
     <w:multiLevelType w:val="singleLevel"/>
-    <w:tmpl w:val="29761A62"/>
+    <w:tmpl w:val="5BFC44B0"/>
     <w:lvl w:ilvl="0">
       <w:start w:val="1"/>
       <w:numFmt w:val="bullet"/>
@@ -1666,6 +2166,119 @@
       </w:pPr>
       <w:rPr>
         <w:rFonts w:ascii="Symbol" w:hAnsi="Symbol" w:hint="default"/>
+      </w:rPr>
+    </w:lvl>
+  </w:abstractNum>
+  <w:abstractNum w:abstractNumId="9" w15:restartNumberingAfterBreak="0">
+    <w:nsid w:val="52402006"/>
+    <w:multiLevelType w:val="hybridMultilevel"/>
+    <w:tmpl w:val="581ECB90"/>
+    <w:lvl w:ilvl="0" w:tplc="04160001">
+      <w:start w:val="1"/>
+      <w:numFmt w:val="bullet"/>
+      <w:lvlText w:val=""/>
+      <w:lvlJc w:val="left"/>
+      <w:pPr>
+        <w:ind w:left="720" w:hanging="360"/>
+      </w:pPr>
+      <w:rPr>
+        <w:rFonts w:ascii="Symbol" w:hAnsi="Symbol" w:hint="default"/>
+      </w:rPr>
+    </w:lvl>
+    <w:lvl w:ilvl="1" w:tplc="04160003" w:tentative="1">
+      <w:start w:val="1"/>
+      <w:numFmt w:val="bullet"/>
+      <w:lvlText w:val="o"/>
+      <w:lvlJc w:val="left"/>
+      <w:pPr>
+        <w:ind w:left="1440" w:hanging="360"/>
+      </w:pPr>
+      <w:rPr>
+        <w:rFonts w:ascii="Courier New" w:hAnsi="Courier New" w:cs="Courier New" w:hint="default"/>
+      </w:rPr>
+    </w:lvl>
+    <w:lvl w:ilvl="2" w:tplc="04160005" w:tentative="1">
+      <w:start w:val="1"/>
+      <w:numFmt w:val="bullet"/>
+      <w:lvlText w:val=""/>
+      <w:lvlJc w:val="left"/>
+      <w:pPr>
+        <w:ind w:left="2160" w:hanging="360"/>
+      </w:pPr>
+      <w:rPr>
+        <w:rFonts w:ascii="Wingdings" w:hAnsi="Wingdings" w:hint="default"/>
+      </w:rPr>
+    </w:lvl>
+    <w:lvl w:ilvl="3" w:tplc="04160001" w:tentative="1">
+      <w:start w:val="1"/>
+      <w:numFmt w:val="bullet"/>
+      <w:lvlText w:val=""/>
+      <w:lvlJc w:val="left"/>
+      <w:pPr>
+        <w:ind w:left="2880" w:hanging="360"/>
+      </w:pPr>
+      <w:rPr>
+        <w:rFonts w:ascii="Symbol" w:hAnsi="Symbol" w:hint="default"/>
+      </w:rPr>
+    </w:lvl>
+    <w:lvl w:ilvl="4" w:tplc="04160003" w:tentative="1">
+      <w:start w:val="1"/>
+      <w:numFmt w:val="bullet"/>
+      <w:lvlText w:val="o"/>
+      <w:lvlJc w:val="left"/>
+      <w:pPr>
+        <w:ind w:left="3600" w:hanging="360"/>
+      </w:pPr>
+      <w:rPr>
+        <w:rFonts w:ascii="Courier New" w:hAnsi="Courier New" w:cs="Courier New" w:hint="default"/>
+      </w:rPr>
+    </w:lvl>
+    <w:lvl w:ilvl="5" w:tplc="04160005" w:tentative="1">
+      <w:start w:val="1"/>
+      <w:numFmt w:val="bullet"/>
+      <w:lvlText w:val=""/>
+      <w:lvlJc w:val="left"/>
+      <w:pPr>
+        <w:ind w:left="4320" w:hanging="360"/>
+      </w:pPr>
+      <w:rPr>
+        <w:rFonts w:ascii="Wingdings" w:hAnsi="Wingdings" w:hint="default"/>
+      </w:rPr>
+    </w:lvl>
+    <w:lvl w:ilvl="6" w:tplc="04160001" w:tentative="1">
+      <w:start w:val="1"/>
+      <w:numFmt w:val="bullet"/>
+      <w:lvlText w:val=""/>
+      <w:lvlJc w:val="left"/>
+      <w:pPr>
+        <w:ind w:left="5040" w:hanging="360"/>
+      </w:pPr>
+      <w:rPr>
+        <w:rFonts w:ascii="Symbol" w:hAnsi="Symbol" w:hint="default"/>
+      </w:rPr>
+    </w:lvl>
+    <w:lvl w:ilvl="7" w:tplc="04160003" w:tentative="1">
+      <w:start w:val="1"/>
+      <w:numFmt w:val="bullet"/>
+      <w:lvlText w:val="o"/>
+      <w:lvlJc w:val="left"/>
+      <w:pPr>
+        <w:ind w:left="5760" w:hanging="360"/>
+      </w:pPr>
+      <w:rPr>
+        <w:rFonts w:ascii="Courier New" w:hAnsi="Courier New" w:cs="Courier New" w:hint="default"/>
+      </w:rPr>
+    </w:lvl>
+    <w:lvl w:ilvl="8" w:tplc="04160005" w:tentative="1">
+      <w:start w:val="1"/>
+      <w:numFmt w:val="bullet"/>
+      <w:lvlText w:val=""/>
+      <w:lvlJc w:val="left"/>
+      <w:pPr>
+        <w:ind w:left="6480" w:hanging="360"/>
+      </w:pPr>
+      <w:rPr>
+        <w:rFonts w:ascii="Wingdings" w:hAnsi="Wingdings" w:hint="default"/>
       </w:rPr>
     </w:lvl>
   </w:abstractNum>
@@ -1696,11 +2309,14 @@
   <w:num w:numId="9" w16cid:durableId="282076127">
     <w:abstractNumId w:val="0"/>
   </w:num>
+  <w:num w:numId="10" w16cid:durableId="211117528">
+    <w:abstractNumId w:val="9"/>
+  </w:num>
 </w:numbering>
 </file>
 
 <file path=word/styles.xml><?xml version="1.0" encoding="utf-8"?>
-<w:styles xmlns:mc="http://schemas.openxmlformats.org/markup-compatibility/2006" xmlns:r="http://schemas.openxmlformats.org/officeDocument/2006/relationships" xmlns:w="http://schemas.openxmlformats.org/wordprocessingml/2006/main" xmlns:w14="http://schemas.microsoft.com/office/word/2010/wordml" xmlns:w15="http://schemas.microsoft.com/office/word/2012/wordml" xmlns:w16cex="http://schemas.microsoft.com/office/word/2018/wordml/cex" xmlns:w16cid="http://schemas.microsoft.com/office/word/2016/wordml/cid" xmlns:w16="http://schemas.microsoft.com/office/word/2018/wordml" xmlns:w16du="http://schemas.microsoft.com/office/word/2023/wordml/word16du" xmlns:w16sdtdh="http://schemas.microsoft.com/office/word/2020/wordml/sdtdatahash" xmlns:w16sdtfl="http://schemas.microsoft.com/office/word/2024/wordml/sdtformatlock" xmlns:w16se="http://schemas.microsoft.com/office/word/2015/wordml/symex" mc:Ignorable="w14 w15 w16se w16cid w16 w16cex w16sdtdh w16sdtfl w16du">
+<w:styles xmlns:mc="http://schemas.openxmlformats.org/markup-compatibility/2006" xmlns:r="http://schemas.openxmlformats.org/officeDocument/2006/relationships" xmlns:w="http://schemas.openxmlformats.org/wordprocessingml/2006/main" xmlns:w14="http://schemas.microsoft.com/office/word/2010/wordml" xmlns:w15="http://schemas.microsoft.com/office/word/2012/wordml" xmlns:w16cex="http://schemas.microsoft.com/office/word/2018/wordml/cex" xmlns:w16cid="http://schemas.microsoft.com/office/word/2016/wordml/cid" xmlns:w16="http://schemas.microsoft.com/office/word/2018/wordml" xmlns:w16sdtdh="http://schemas.microsoft.com/office/word/2020/wordml/sdtdatahash" xmlns:w16se="http://schemas.microsoft.com/office/word/2015/wordml/symex" mc:Ignorable="w14 w15 w16se w16cid w16 w16cex w16sdtdh">
   <w:docDefaults>
     <w:rPrDefault>
       <w:rPr>

</xml_diff>

<commit_message>
Nona Versão - Parte 01
</commit_message>
<xml_diff>
--- a/docs/conceitos_componentes_para_o_site.docx
+++ b/docs/conceitos_componentes_para_o_site.docx
@@ -1,6 +1,6 @@
 
 <file path=word/document.xml><?xml version="1.0" encoding="utf-8"?>
-<w:document xmlns:wpc="http://schemas.microsoft.com/office/word/2010/wordprocessingCanvas" xmlns:cx="http://schemas.microsoft.com/office/drawing/2014/chartex" xmlns:cx1="http://schemas.microsoft.com/office/drawing/2015/9/8/chartex" xmlns:cx2="http://schemas.microsoft.com/office/drawing/2015/10/21/chartex" xmlns:cx3="http://schemas.microsoft.com/office/drawing/2016/5/9/chartex" xmlns:cx4="http://schemas.microsoft.com/office/drawing/2016/5/10/chartex" xmlns:cx5="http://schemas.microsoft.com/office/drawing/2016/5/11/chartex" xmlns:cx6="http://schemas.microsoft.com/office/drawing/2016/5/12/chartex" xmlns:cx7="http://schemas.microsoft.com/office/drawing/2016/5/13/chartex" xmlns:cx8="http://schemas.microsoft.com/office/drawing/2016/5/14/chartex" xmlns:mc="http://schemas.openxmlformats.org/markup-compatibility/2006" xmlns:aink="http://schemas.microsoft.com/office/drawing/2016/ink" xmlns:am3d="http://schemas.microsoft.com/office/drawing/2017/model3d" xmlns:o="urn:schemas-microsoft-com:office:office" xmlns:oel="http://schemas.microsoft.com/office/2019/extlst" xmlns:r="http://schemas.openxmlformats.org/officeDocument/2006/relationships" xmlns:m="http://schemas.openxmlformats.org/officeDocument/2006/math" xmlns:v="urn:schemas-microsoft-com:vml" xmlns:wp14="http://schemas.microsoft.com/office/word/2010/wordprocessingDrawing" xmlns:wp="http://schemas.openxmlformats.org/drawingml/2006/wordprocessingDrawing" xmlns:w10="urn:schemas-microsoft-com:office:word" xmlns:w="http://schemas.openxmlformats.org/wordprocessingml/2006/main" xmlns:w14="http://schemas.microsoft.com/office/word/2010/wordml" xmlns:w15="http://schemas.microsoft.com/office/word/2012/wordml" xmlns:w16cex="http://schemas.microsoft.com/office/word/2018/wordml/cex" xmlns:w16cid="http://schemas.microsoft.com/office/word/2016/wordml/cid" xmlns:w16="http://schemas.microsoft.com/office/word/2018/wordml" xmlns:w16du="http://schemas.microsoft.com/office/word/2023/wordml/word16du" xmlns:w16sdtdh="http://schemas.microsoft.com/office/word/2020/wordml/sdtdatahash" xmlns:w16sdtfl="http://schemas.microsoft.com/office/word/2024/wordml/sdtformatlock" xmlns:w16se="http://schemas.microsoft.com/office/word/2015/wordml/symex" xmlns:wpg="http://schemas.microsoft.com/office/word/2010/wordprocessingGroup" xmlns:wpi="http://schemas.microsoft.com/office/word/2010/wordprocessingInk" xmlns:wne="http://schemas.microsoft.com/office/word/2006/wordml" xmlns:wps="http://schemas.microsoft.com/office/word/2010/wordprocessingShape" mc:Ignorable="w14 w15 w16se w16cid w16 w16cex w16sdtdh w16sdtfl w16du wp14">
+<w:document xmlns:wpc="http://schemas.microsoft.com/office/word/2010/wordprocessingCanvas" xmlns:cx="http://schemas.microsoft.com/office/drawing/2014/chartex" xmlns:cx1="http://schemas.microsoft.com/office/drawing/2015/9/8/chartex" xmlns:cx2="http://schemas.microsoft.com/office/drawing/2015/10/21/chartex" xmlns:cx3="http://schemas.microsoft.com/office/drawing/2016/5/9/chartex" xmlns:cx4="http://schemas.microsoft.com/office/drawing/2016/5/10/chartex" xmlns:cx5="http://schemas.microsoft.com/office/drawing/2016/5/11/chartex" xmlns:cx6="http://schemas.microsoft.com/office/drawing/2016/5/12/chartex" xmlns:cx7="http://schemas.microsoft.com/office/drawing/2016/5/13/chartex" xmlns:cx8="http://schemas.microsoft.com/office/drawing/2016/5/14/chartex" xmlns:mc="http://schemas.openxmlformats.org/markup-compatibility/2006" xmlns:aink="http://schemas.microsoft.com/office/drawing/2016/ink" xmlns:am3d="http://schemas.microsoft.com/office/drawing/2017/model3d" xmlns:o="urn:schemas-microsoft-com:office:office" xmlns:oel="http://schemas.microsoft.com/office/2019/extlst" xmlns:r="http://schemas.openxmlformats.org/officeDocument/2006/relationships" xmlns:m="http://schemas.openxmlformats.org/officeDocument/2006/math" xmlns:v="urn:schemas-microsoft-com:vml" xmlns:wp14="http://schemas.microsoft.com/office/word/2010/wordprocessingDrawing" xmlns:wp="http://schemas.openxmlformats.org/drawingml/2006/wordprocessingDrawing" xmlns:w10="urn:schemas-microsoft-com:office:word" xmlns:w="http://schemas.openxmlformats.org/wordprocessingml/2006/main" xmlns:w14="http://schemas.microsoft.com/office/word/2010/wordml" xmlns:w15="http://schemas.microsoft.com/office/word/2012/wordml" xmlns:w16cex="http://schemas.microsoft.com/office/word/2018/wordml/cex" xmlns:w16cid="http://schemas.microsoft.com/office/word/2016/wordml/cid" xmlns:w16="http://schemas.microsoft.com/office/word/2018/wordml" xmlns:w16sdtdh="http://schemas.microsoft.com/office/word/2020/wordml/sdtdatahash" xmlns:w16se="http://schemas.microsoft.com/office/word/2015/wordml/symex" xmlns:wpg="http://schemas.microsoft.com/office/word/2010/wordprocessingGroup" xmlns:wpi="http://schemas.microsoft.com/office/word/2010/wordprocessingInk" xmlns:wne="http://schemas.microsoft.com/office/word/2006/wordml" xmlns:wps="http://schemas.microsoft.com/office/word/2010/wordprocessingShape" mc:Ignorable="w14 w15 w16se w16cid w16 w16cex w16sdtdh wp14">
   <w:body>
     <w:p>
       <w:pPr>
@@ -2035,6 +2035,874 @@
         </w:rPr>
         <w:t>Controle de infraestruturas como sistemas de bombeamento de água, elevadores e semáforos inteligentes.</w:t>
       </w:r>
+    </w:p>
+    <w:p>
+      <w:pPr>
+        <w:pBdr>
+          <w:bottom w:val="single" w:sz="6" w:space="1" w:color="auto"/>
+        </w:pBdr>
+        <w:spacing w:after="0"/>
+        <w:rPr>
+          <w:rFonts w:ascii="Arial" w:hAnsi="Arial" w:cs="Arial"/>
+        </w:rPr>
+      </w:pPr>
+    </w:p>
+    <w:p>
+      <w:pPr>
+        <w:spacing w:after="0"/>
+        <w:rPr>
+          <w:rFonts w:ascii="Arial" w:hAnsi="Arial" w:cs="Arial"/>
+        </w:rPr>
+      </w:pPr>
+    </w:p>
+    <w:p>
+      <w:pPr>
+        <w:spacing w:after="0"/>
+        <w:rPr>
+          <w:rFonts w:ascii="Arial" w:hAnsi="Arial" w:cs="Arial"/>
+          <w:b/>
+          <w:bCs/>
+          <w:color w:val="2E74B5" w:themeColor="accent5" w:themeShade="BF"/>
+          <w:sz w:val="32"/>
+          <w:szCs w:val="32"/>
+        </w:rPr>
+      </w:pPr>
+      <w:r>
+        <w:rPr>
+          <w:rFonts w:ascii="Arial" w:hAnsi="Arial" w:cs="Arial"/>
+          <w:b/>
+          <w:bCs/>
+          <w:color w:val="2E74B5" w:themeColor="accent5" w:themeShade="BF"/>
+          <w:sz w:val="32"/>
+          <w:szCs w:val="32"/>
+        </w:rPr>
+        <w:t>1</w:t>
+      </w:r>
+      <w:r>
+        <w:rPr>
+          <w:rFonts w:ascii="Arial" w:hAnsi="Arial" w:cs="Arial"/>
+          <w:b/>
+          <w:bCs/>
+          <w:color w:val="2E74B5" w:themeColor="accent5" w:themeShade="BF"/>
+          <w:sz w:val="32"/>
+          <w:szCs w:val="32"/>
+        </w:rPr>
+        <w:t>2</w:t>
+      </w:r>
+      <w:r>
+        <w:rPr>
+          <w:rFonts w:ascii="Arial" w:hAnsi="Arial" w:cs="Arial"/>
+          <w:b/>
+          <w:bCs/>
+          <w:color w:val="2E74B5" w:themeColor="accent5" w:themeShade="BF"/>
+          <w:sz w:val="32"/>
+          <w:szCs w:val="32"/>
+        </w:rPr>
+        <w:t xml:space="preserve">. </w:t>
+      </w:r>
+      <w:r>
+        <w:rPr>
+          <w:rFonts w:ascii="Arial" w:hAnsi="Arial" w:cs="Arial"/>
+          <w:b/>
+          <w:bCs/>
+          <w:color w:val="2E74B5" w:themeColor="accent5" w:themeShade="BF"/>
+          <w:sz w:val="32"/>
+          <w:szCs w:val="32"/>
+        </w:rPr>
+        <w:t>Plaqueta de Identificação do CLP</w:t>
+      </w:r>
+    </w:p>
+    <w:p>
+      <w:pPr>
+        <w:spacing w:after="0"/>
+        <w:rPr>
+          <w:rFonts w:ascii="Arial" w:hAnsi="Arial" w:cs="Arial"/>
+        </w:rPr>
+      </w:pPr>
+    </w:p>
+    <w:p>
+      <w:pPr>
+        <w:spacing w:after="0"/>
+        <w:rPr>
+          <w:rFonts w:ascii="Arial" w:hAnsi="Arial" w:cs="Arial"/>
+        </w:rPr>
+      </w:pPr>
+      <w:r>
+        <w:rPr>
+          <w:rFonts w:ascii="Arial" w:hAnsi="Arial" w:cs="Arial"/>
+        </w:rPr>
+        <w:t>É a "carteira de identidade" técnica gravada na carcaça externa do CLP (geralmente instalada na sua lateral). Ela reúne, em um único local, todas as especificações elétricas, mecânicas e normativas do dispositivo, fornecendo informações essenciais como: código de encomenda (part number), faixas de alimentação, capacidade de Entradas e Saídas (E/S - I/O), número de série para rastreabilidade e certificações internacionais de segurança industrial.</w:t>
+      </w:r>
+    </w:p>
+    <w:p>
+      <w:pPr>
+        <w:spacing w:after="0"/>
+        <w:rPr>
+          <w:rFonts w:ascii="Arial" w:hAnsi="Arial" w:cs="Arial"/>
+        </w:rPr>
+      </w:pPr>
+    </w:p>
+    <w:p>
+      <w:pPr>
+        <w:spacing w:after="0"/>
+        <w:rPr>
+          <w:rFonts w:ascii="Arial" w:hAnsi="Arial" w:cs="Arial"/>
+        </w:rPr>
+      </w:pPr>
+      <w:r>
+        <w:rPr>
+          <w:rFonts w:ascii="Arial" w:hAnsi="Arial" w:cs="Arial"/>
+          <w:b/>
+          <w:bCs/>
+          <w:u w:val="single"/>
+        </w:rPr>
+        <w:t>Modelo exato:</w:t>
+      </w:r>
+      <w:r>
+        <w:rPr>
+          <w:rFonts w:ascii="Arial" w:hAnsi="Arial" w:cs="Arial"/>
+          <w:b/>
+          <w:bCs/>
+        </w:rPr>
+        <w:t xml:space="preserve"> </w:t>
+      </w:r>
+      <w:r>
+        <w:rPr>
+          <w:rFonts w:ascii="Arial" w:hAnsi="Arial" w:cs="Arial"/>
+        </w:rPr>
+        <w:t>CPU 1214C DC/DC/DC (da linha Siemens SIMATIC S7-1200)</w:t>
+      </w:r>
+    </w:p>
+    <w:p>
+      <w:pPr>
+        <w:spacing w:after="0"/>
+        <w:rPr>
+          <w:rFonts w:ascii="Arial" w:hAnsi="Arial" w:cs="Arial"/>
+        </w:rPr>
+      </w:pPr>
+    </w:p>
+    <w:p>
+      <w:pPr>
+        <w:spacing w:after="0"/>
+        <w:rPr>
+          <w:rFonts w:ascii="Arial" w:hAnsi="Arial" w:cs="Arial"/>
+        </w:rPr>
+      </w:pPr>
+    </w:p>
+    <w:p>
+      <w:pPr>
+        <w:spacing w:after="0"/>
+        <w:rPr>
+          <w:rFonts w:ascii="Arial" w:hAnsi="Arial" w:cs="Arial"/>
+        </w:rPr>
+      </w:pPr>
+      <w:r>
+        <w:rPr>
+          <w:rFonts w:ascii="Arial" w:hAnsi="Arial" w:cs="Arial"/>
+          <w:b/>
+          <w:bCs/>
+          <w:u w:val="single"/>
+        </w:rPr>
+        <w:t>Código de encomenda (Part Number):</w:t>
+      </w:r>
+      <w:r>
+        <w:rPr>
+          <w:rFonts w:ascii="Arial" w:hAnsi="Arial" w:cs="Arial"/>
+          <w:b/>
+          <w:bCs/>
+        </w:rPr>
+        <w:t xml:space="preserve"> </w:t>
+      </w:r>
+      <w:r>
+        <w:rPr>
+          <w:rFonts w:ascii="Arial" w:hAnsi="Arial" w:cs="Arial"/>
+        </w:rPr>
+        <w:t>6ES7 214-1AE30-0XB0</w:t>
+      </w:r>
+    </w:p>
+    <w:p>
+      <w:pPr>
+        <w:spacing w:after="0"/>
+        <w:rPr>
+          <w:rFonts w:ascii="Arial" w:hAnsi="Arial" w:cs="Arial"/>
+        </w:rPr>
+      </w:pPr>
+    </w:p>
+    <w:p>
+      <w:pPr>
+        <w:spacing w:after="0"/>
+        <w:rPr>
+          <w:rFonts w:ascii="Arial" w:hAnsi="Arial" w:cs="Arial"/>
+        </w:rPr>
+      </w:pPr>
+    </w:p>
+    <w:p>
+      <w:pPr>
+        <w:spacing w:after="0"/>
+        <w:rPr>
+          <w:rFonts w:ascii="Arial" w:hAnsi="Arial" w:cs="Arial"/>
+        </w:rPr>
+      </w:pPr>
+      <w:r>
+        <w:rPr>
+          <w:rFonts w:ascii="Arial" w:hAnsi="Arial" w:cs="Arial"/>
+          <w:b/>
+          <w:bCs/>
+          <w:u w:val="single"/>
+        </w:rPr>
+        <w:t>Faixas de alimentação:</w:t>
+      </w:r>
+      <w:r>
+        <w:rPr>
+          <w:rFonts w:ascii="Arial" w:hAnsi="Arial" w:cs="Arial"/>
+          <w:b/>
+          <w:bCs/>
+        </w:rPr>
+        <w:t xml:space="preserve"> </w:t>
+      </w:r>
+      <w:r>
+        <w:rPr>
+          <w:rFonts w:ascii="Arial" w:hAnsi="Arial" w:cs="Arial"/>
+        </w:rPr>
+        <w:t>SUPPLY 24VDC (Alimentação em 24 Volts de Corrente Contínua)</w:t>
+      </w:r>
+    </w:p>
+    <w:p>
+      <w:pPr>
+        <w:spacing w:after="0"/>
+        <w:rPr>
+          <w:rFonts w:ascii="Arial" w:hAnsi="Arial" w:cs="Arial"/>
+        </w:rPr>
+      </w:pPr>
+    </w:p>
+    <w:p>
+      <w:pPr>
+        <w:spacing w:after="0"/>
+        <w:rPr>
+          <w:rFonts w:ascii="Arial" w:hAnsi="Arial" w:cs="Arial"/>
+        </w:rPr>
+      </w:pPr>
+    </w:p>
+    <w:p>
+      <w:pPr>
+        <w:spacing w:after="0"/>
+        <w:rPr>
+          <w:rFonts w:ascii="Arial" w:hAnsi="Arial" w:cs="Arial"/>
+          <w:b/>
+          <w:bCs/>
+          <w:u w:val="single"/>
+        </w:rPr>
+      </w:pPr>
+      <w:r>
+        <w:rPr>
+          <w:rFonts w:ascii="Arial" w:hAnsi="Arial" w:cs="Arial"/>
+          <w:b/>
+          <w:bCs/>
+          <w:u w:val="single"/>
+        </w:rPr>
+        <w:t xml:space="preserve">Capacidade de Entradas e Saídas (E/S) / Inputs and Outputs (I/O): </w:t>
+      </w:r>
+    </w:p>
+    <w:p>
+      <w:pPr>
+        <w:spacing w:after="0"/>
+        <w:rPr>
+          <w:rFonts w:ascii="Arial" w:hAnsi="Arial" w:cs="Arial"/>
+          <w:b/>
+          <w:bCs/>
+          <w:u w:val="single"/>
+        </w:rPr>
+      </w:pPr>
+    </w:p>
+    <w:p>
+      <w:pPr>
+        <w:pStyle w:val="PargrafodaLista"/>
+        <w:numPr>
+          <w:ilvl w:val="0"/>
+          <w:numId w:val="12"/>
+        </w:numPr>
+        <w:rPr>
+          <w:rFonts w:ascii="Arial" w:hAnsi="Arial" w:cs="Arial"/>
+        </w:rPr>
+      </w:pPr>
+      <w:r>
+        <w:rPr>
+          <w:rFonts w:ascii="Arial" w:hAnsi="Arial" w:cs="Arial"/>
+          <w:b/>
+          <w:bCs/>
+        </w:rPr>
+        <w:t>Entradas Digitais (DI):</w:t>
+      </w:r>
+      <w:r>
+        <w:rPr>
+          <w:rFonts w:ascii="Arial" w:hAnsi="Arial" w:cs="Arial"/>
+        </w:rPr>
+        <w:t> DI 14x24VDC (14 Entradas Digitais em 24V DC)</w:t>
+      </w:r>
+      <w:r>
+        <w:rPr>
+          <w:rFonts w:ascii="Arial" w:hAnsi="Arial" w:cs="Arial"/>
+        </w:rPr>
+        <w:br/>
+      </w:r>
+    </w:p>
+    <w:p>
+      <w:pPr>
+        <w:pStyle w:val="PargrafodaLista"/>
+        <w:numPr>
+          <w:ilvl w:val="0"/>
+          <w:numId w:val="12"/>
+        </w:numPr>
+        <w:spacing w:after="0"/>
+        <w:rPr>
+          <w:rFonts w:ascii="Arial" w:hAnsi="Arial" w:cs="Arial"/>
+        </w:rPr>
+      </w:pPr>
+      <w:r>
+        <w:rPr>
+          <w:rFonts w:ascii="Arial" w:hAnsi="Arial" w:cs="Arial"/>
+          <w:b/>
+          <w:bCs/>
+        </w:rPr>
+        <w:t>Saídas Digitais (DQ):</w:t>
+      </w:r>
+      <w:r>
+        <w:rPr>
+          <w:rFonts w:ascii="Arial" w:hAnsi="Arial" w:cs="Arial"/>
+        </w:rPr>
+        <w:t> DQ 10x24VDC 0.5A (10 Saídas Digitais a transistor em 24V DC com capacidade de 0,5A por canal)</w:t>
+      </w:r>
+    </w:p>
+    <w:p>
+      <w:pPr>
+        <w:spacing w:after="0"/>
+        <w:rPr>
+          <w:rFonts w:ascii="Arial" w:hAnsi="Arial" w:cs="Arial"/>
+        </w:rPr>
+      </w:pPr>
+    </w:p>
+    <w:p>
+      <w:pPr>
+        <w:pStyle w:val="PargrafodaLista"/>
+        <w:numPr>
+          <w:ilvl w:val="0"/>
+          <w:numId w:val="12"/>
+        </w:numPr>
+        <w:spacing w:after="0"/>
+        <w:rPr>
+          <w:rFonts w:ascii="Arial" w:hAnsi="Arial" w:cs="Arial"/>
+        </w:rPr>
+      </w:pPr>
+      <w:r>
+        <w:rPr>
+          <w:rFonts w:ascii="Arial" w:hAnsi="Arial" w:cs="Arial"/>
+          <w:b/>
+          <w:bCs/>
+        </w:rPr>
+        <w:t>Entradas Analógicas (AI):</w:t>
+      </w:r>
+      <w:r>
+        <w:rPr>
+          <w:rFonts w:ascii="Arial" w:hAnsi="Arial" w:cs="Arial"/>
+        </w:rPr>
+        <w:t> AI 2x10 BIT 0-10VDC (2 Entradas Analógicas de 0 a 10V DC com resolução de 10 bits)</w:t>
+      </w:r>
+    </w:p>
+    <w:p>
+      <w:pPr>
+        <w:spacing w:after="0"/>
+        <w:rPr>
+          <w:rFonts w:ascii="Arial" w:hAnsi="Arial" w:cs="Arial"/>
+        </w:rPr>
+      </w:pPr>
+    </w:p>
+    <w:p>
+      <w:pPr>
+        <w:spacing w:after="0"/>
+        <w:rPr>
+          <w:rFonts w:ascii="Arial" w:hAnsi="Arial" w:cs="Arial"/>
+        </w:rPr>
+      </w:pPr>
+    </w:p>
+    <w:p>
+      <w:pPr>
+        <w:spacing w:after="0"/>
+        <w:rPr>
+          <w:rFonts w:ascii="Arial" w:hAnsi="Arial" w:cs="Arial"/>
+        </w:rPr>
+      </w:pPr>
+      <w:r>
+        <w:rPr>
+          <w:rFonts w:ascii="Arial" w:hAnsi="Arial" w:cs="Arial"/>
+          <w:b/>
+          <w:bCs/>
+          <w:u w:val="single"/>
+        </w:rPr>
+        <w:t>Número de série para rastreabilidade:</w:t>
+      </w:r>
+      <w:r>
+        <w:rPr>
+          <w:rFonts w:ascii="Arial" w:hAnsi="Arial" w:cs="Arial"/>
+          <w:b/>
+          <w:bCs/>
+        </w:rPr>
+        <w:t xml:space="preserve"> </w:t>
+      </w:r>
+      <w:r>
+        <w:rPr>
+          <w:rFonts w:ascii="Arial" w:hAnsi="Arial" w:cs="Arial"/>
+        </w:rPr>
+        <w:t>S ZVC1YYW055801 (com versão de revisão de hardware E-Stand: 02)</w:t>
+      </w:r>
+    </w:p>
+    <w:p>
+      <w:pPr>
+        <w:spacing w:after="0"/>
+        <w:rPr>
+          <w:rFonts w:ascii="Arial" w:hAnsi="Arial" w:cs="Arial"/>
+        </w:rPr>
+      </w:pPr>
+    </w:p>
+    <w:p>
+      <w:pPr>
+        <w:spacing w:after="0"/>
+        <w:rPr>
+          <w:rFonts w:ascii="Arial" w:hAnsi="Arial" w:cs="Arial"/>
+        </w:rPr>
+      </w:pPr>
+    </w:p>
+    <w:p>
+      <w:pPr>
+        <w:spacing w:after="0"/>
+        <w:rPr>
+          <w:rFonts w:ascii="Arial" w:hAnsi="Arial" w:cs="Arial"/>
+          <w:b/>
+          <w:bCs/>
+          <w:u w:val="single"/>
+        </w:rPr>
+      </w:pPr>
+      <w:r>
+        <w:rPr>
+          <w:rFonts w:ascii="Arial" w:hAnsi="Arial" w:cs="Arial"/>
+          <w:b/>
+          <w:bCs/>
+          <w:u w:val="single"/>
+        </w:rPr>
+        <w:t xml:space="preserve">Certificações internacionais de segurança industrial: </w:t>
+      </w:r>
+    </w:p>
+    <w:p>
+      <w:pPr>
+        <w:spacing w:after="0"/>
+        <w:rPr>
+          <w:rFonts w:ascii="Arial" w:hAnsi="Arial" w:cs="Arial"/>
+          <w:b/>
+          <w:bCs/>
+          <w:u w:val="single"/>
+        </w:rPr>
+      </w:pPr>
+    </w:p>
+    <w:p>
+      <w:pPr>
+        <w:pStyle w:val="PargrafodaLista"/>
+        <w:numPr>
+          <w:ilvl w:val="0"/>
+          <w:numId w:val="12"/>
+        </w:numPr>
+        <w:rPr>
+          <w:rFonts w:ascii="Arial" w:hAnsi="Arial" w:cs="Arial"/>
+        </w:rPr>
+      </w:pPr>
+      <w:r>
+        <w:rPr>
+          <w:rFonts w:ascii="Arial" w:hAnsi="Arial" w:cs="Arial"/>
+          <w:b/>
+          <w:bCs/>
+        </w:rPr>
+        <w:t xml:space="preserve">cULus Listed: </w:t>
+      </w:r>
+      <w:r>
+        <w:rPr>
+          <w:rFonts w:ascii="Arial" w:hAnsi="Arial" w:cs="Arial"/>
+        </w:rPr>
+        <w:t>Certificação de segurança elétrica para Estados Unidos e Canadá.</w:t>
+      </w:r>
+      <w:r>
+        <w:rPr>
+          <w:rFonts w:ascii="Arial" w:hAnsi="Arial" w:cs="Arial"/>
+        </w:rPr>
+        <w:br/>
+      </w:r>
+    </w:p>
+    <w:p>
+      <w:pPr>
+        <w:pStyle w:val="PargrafodaLista"/>
+        <w:numPr>
+          <w:ilvl w:val="0"/>
+          <w:numId w:val="12"/>
+        </w:numPr>
+        <w:spacing w:after="0"/>
+        <w:rPr>
+          <w:rFonts w:ascii="Arial" w:hAnsi="Arial" w:cs="Arial"/>
+        </w:rPr>
+      </w:pPr>
+      <w:r>
+        <w:rPr>
+          <w:rFonts w:ascii="Arial" w:hAnsi="Arial" w:cs="Arial"/>
+          <w:b/>
+          <w:bCs/>
+        </w:rPr>
+        <w:t xml:space="preserve">Ex / ATEX (II 3 G Ex nA II T4): </w:t>
+      </w:r>
+      <w:r>
+        <w:rPr>
+          <w:rFonts w:ascii="Arial" w:hAnsi="Arial" w:cs="Arial"/>
+        </w:rPr>
+        <w:t>Certificação europeia para operação segura em áreas com atmosferas explosivas.</w:t>
+      </w:r>
+    </w:p>
+    <w:p>
+      <w:pPr>
+        <w:spacing w:after="0"/>
+        <w:rPr>
+          <w:rFonts w:ascii="Arial" w:hAnsi="Arial" w:cs="Arial"/>
+        </w:rPr>
+      </w:pPr>
+    </w:p>
+    <w:p>
+      <w:pPr>
+        <w:pStyle w:val="PargrafodaLista"/>
+        <w:numPr>
+          <w:ilvl w:val="0"/>
+          <w:numId w:val="12"/>
+        </w:numPr>
+        <w:spacing w:after="0"/>
+        <w:rPr>
+          <w:rFonts w:ascii="Arial" w:hAnsi="Arial" w:cs="Arial"/>
+        </w:rPr>
+      </w:pPr>
+      <w:r>
+        <w:rPr>
+          <w:rFonts w:ascii="Arial" w:hAnsi="Arial" w:cs="Arial"/>
+          <w:b/>
+          <w:bCs/>
+        </w:rPr>
+        <w:t>FM Approved (CLASS I, DIV 2):</w:t>
+      </w:r>
+      <w:r>
+        <w:rPr>
+          <w:rFonts w:ascii="Arial" w:hAnsi="Arial" w:cs="Arial"/>
+        </w:rPr>
+        <w:t xml:space="preserve"> Certificação para áreas industriais classificadas com risco de gases/vapores inflamáveis.</w:t>
+      </w:r>
+    </w:p>
+    <w:p>
+      <w:pPr>
+        <w:pStyle w:val="PargrafodaLista"/>
+        <w:rPr>
+          <w:rFonts w:ascii="Arial" w:hAnsi="Arial" w:cs="Arial"/>
+        </w:rPr>
+      </w:pPr>
+    </w:p>
+    <w:p>
+      <w:pPr>
+        <w:pStyle w:val="PargrafodaLista"/>
+        <w:numPr>
+          <w:ilvl w:val="0"/>
+          <w:numId w:val="12"/>
+        </w:numPr>
+        <w:spacing w:after="0"/>
+        <w:rPr>
+          <w:rFonts w:ascii="Arial" w:hAnsi="Arial" w:cs="Arial"/>
+        </w:rPr>
+      </w:pPr>
+      <w:r>
+        <w:rPr>
+          <w:rFonts w:ascii="Arial" w:hAnsi="Arial" w:cs="Arial"/>
+          <w:b/>
+          <w:bCs/>
+        </w:rPr>
+        <w:t>CE:</w:t>
+      </w:r>
+      <w:r>
+        <w:rPr>
+          <w:rFonts w:ascii="Arial" w:hAnsi="Arial" w:cs="Arial"/>
+        </w:rPr>
+        <w:t xml:space="preserve"> Marcação de Conformidade Europeia com as diretivas de segurança e saúde.</w:t>
+      </w:r>
+    </w:p>
+    <w:p>
+      <w:pPr>
+        <w:pStyle w:val="PargrafodaLista"/>
+        <w:rPr>
+          <w:rFonts w:ascii="Arial" w:hAnsi="Arial" w:cs="Arial"/>
+        </w:rPr>
+      </w:pPr>
+    </w:p>
+    <w:p>
+      <w:pPr>
+        <w:pStyle w:val="PargrafodaLista"/>
+        <w:numPr>
+          <w:ilvl w:val="0"/>
+          <w:numId w:val="12"/>
+        </w:numPr>
+        <w:spacing w:after="0"/>
+        <w:rPr>
+          <w:rFonts w:ascii="Arial" w:hAnsi="Arial" w:cs="Arial"/>
+        </w:rPr>
+      </w:pPr>
+      <w:r>
+        <w:rPr>
+          <w:rFonts w:ascii="Arial" w:hAnsi="Arial" w:cs="Arial"/>
+          <w:b/>
+          <w:bCs/>
+        </w:rPr>
+        <w:t>KCC (KCC-REM-S49-S71200):</w:t>
+      </w:r>
+      <w:r>
+        <w:rPr>
+          <w:rFonts w:ascii="Arial" w:hAnsi="Arial" w:cs="Arial"/>
+        </w:rPr>
+        <w:t xml:space="preserve"> Certificação de compatibilidade eletromagnética da Coreia do Sul.</w:t>
+      </w:r>
+    </w:p>
+    <w:p>
+      <w:pPr>
+        <w:pStyle w:val="PargrafodaLista"/>
+        <w:rPr>
+          <w:rFonts w:ascii="Arial" w:hAnsi="Arial" w:cs="Arial"/>
+        </w:rPr>
+      </w:pPr>
+    </w:p>
+    <w:p>
+      <w:pPr>
+        <w:pStyle w:val="PargrafodaLista"/>
+        <w:numPr>
+          <w:ilvl w:val="0"/>
+          <w:numId w:val="12"/>
+        </w:numPr>
+        <w:spacing w:after="0"/>
+        <w:rPr>
+          <w:rFonts w:ascii="Arial" w:hAnsi="Arial" w:cs="Arial"/>
+        </w:rPr>
+      </w:pPr>
+      <w:r>
+        <w:rPr>
+          <w:rFonts w:ascii="Arial" w:hAnsi="Arial" w:cs="Arial"/>
+          <w:b/>
+          <w:bCs/>
+        </w:rPr>
+        <w:t>RCM / C-Tick:</w:t>
+      </w:r>
+      <w:r>
+        <w:rPr>
+          <w:rFonts w:ascii="Arial" w:hAnsi="Arial" w:cs="Arial"/>
+        </w:rPr>
+        <w:t xml:space="preserve"> Certificação de conformidade eletromagnética para a Austrália e Nova Zelândia.</w:t>
+      </w:r>
+    </w:p>
+    <w:p>
+      <w:pPr>
+        <w:spacing w:after="0"/>
+        <w:rPr>
+          <w:rFonts w:ascii="Arial" w:hAnsi="Arial" w:cs="Arial"/>
+        </w:rPr>
+      </w:pPr>
+    </w:p>
+    <w:p>
+      <w:pPr>
+        <w:spacing w:after="0"/>
+        <w:rPr>
+          <w:rFonts w:ascii="Arial" w:hAnsi="Arial" w:cs="Arial"/>
+        </w:rPr>
+      </w:pPr>
+    </w:p>
+    <w:p>
+      <w:pPr>
+        <w:spacing w:after="0"/>
+        <w:rPr>
+          <w:rFonts w:ascii="Arial" w:hAnsi="Arial" w:cs="Arial"/>
+          <w:b/>
+          <w:bCs/>
+        </w:rPr>
+      </w:pPr>
+      <w:r>
+        <w:rPr>
+          <w:rFonts w:ascii="Arial" w:hAnsi="Arial" w:cs="Arial"/>
+          <w:b/>
+          <w:bCs/>
+        </w:rPr>
+        <w:t>Aplicações:</w:t>
+      </w:r>
+    </w:p>
+    <w:p>
+      <w:pPr>
+        <w:spacing w:after="0"/>
+        <w:rPr>
+          <w:rFonts w:ascii="Arial" w:hAnsi="Arial" w:cs="Arial"/>
+        </w:rPr>
+      </w:pPr>
+    </w:p>
+    <w:p>
+      <w:pPr>
+        <w:pStyle w:val="PargrafodaLista"/>
+        <w:numPr>
+          <w:ilvl w:val="0"/>
+          <w:numId w:val="2"/>
+        </w:numPr>
+        <w:spacing w:after="0"/>
+        <w:rPr>
+          <w:rFonts w:ascii="Arial" w:hAnsi="Arial" w:cs="Arial"/>
+        </w:rPr>
+      </w:pPr>
+      <w:r>
+        <w:rPr>
+          <w:rFonts w:ascii="Arial" w:hAnsi="Arial" w:cs="Arial"/>
+          <w:b/>
+          <w:bCs/>
+        </w:rPr>
+        <w:t>Seleção de Hardware no Software de Programação:</w:t>
+      </w:r>
+      <w:r>
+        <w:rPr>
+          <w:rFonts w:ascii="Arial" w:hAnsi="Arial" w:cs="Arial"/>
+        </w:rPr>
+        <w:t xml:space="preserve"> Permite localizar a referência exata (código part number) para a correta inserção e </w:t>
+      </w:r>
+      <w:r>
+        <w:rPr>
+          <w:rFonts w:ascii="Arial" w:hAnsi="Arial" w:cs="Arial"/>
+        </w:rPr>
+        <w:lastRenderedPageBreak/>
+        <w:t>parametrização do modelo na árvore de dispositivos do programa (</w:t>
+      </w:r>
+      <w:proofErr w:type="spellStart"/>
+      <w:r>
+        <w:rPr>
+          <w:rFonts w:ascii="Arial" w:hAnsi="Arial" w:cs="Arial"/>
+        </w:rPr>
+        <w:t>ex</w:t>
+      </w:r>
+      <w:proofErr w:type="spellEnd"/>
+      <w:r>
+        <w:rPr>
+          <w:rFonts w:ascii="Arial" w:hAnsi="Arial" w:cs="Arial"/>
+        </w:rPr>
+        <w:t>: TIA Portal).</w:t>
+      </w:r>
+    </w:p>
+    <w:p>
+      <w:pPr>
+        <w:spacing w:after="0"/>
+        <w:rPr>
+          <w:rFonts w:ascii="Arial" w:hAnsi="Arial" w:cs="Arial"/>
+        </w:rPr>
+      </w:pPr>
+    </w:p>
+    <w:p>
+      <w:pPr>
+        <w:pStyle w:val="PargrafodaLista"/>
+        <w:numPr>
+          <w:ilvl w:val="0"/>
+          <w:numId w:val="2"/>
+        </w:numPr>
+        <w:spacing w:after="0"/>
+        <w:rPr>
+          <w:rFonts w:ascii="Arial" w:hAnsi="Arial" w:cs="Arial"/>
+        </w:rPr>
+      </w:pPr>
+      <w:r>
+        <w:rPr>
+          <w:rFonts w:ascii="Arial" w:hAnsi="Arial" w:cs="Arial"/>
+          <w:b/>
+          <w:bCs/>
+        </w:rPr>
+        <w:t>Dimensionamento do Painel Elétrico:</w:t>
+      </w:r>
+      <w:r>
+        <w:rPr>
+          <w:rFonts w:ascii="Arial" w:hAnsi="Arial" w:cs="Arial"/>
+        </w:rPr>
+        <w:t xml:space="preserve"> Fornece os dados nominais de tensão, corrente e potência para a escolha correta da fonte de alimentação, disjuntores de proteção e cabeamento.</w:t>
+      </w:r>
+    </w:p>
+    <w:p>
+      <w:pPr>
+        <w:spacing w:after="0"/>
+        <w:rPr>
+          <w:rFonts w:ascii="Arial" w:hAnsi="Arial" w:cs="Arial"/>
+        </w:rPr>
+      </w:pPr>
+    </w:p>
+    <w:p>
+      <w:pPr>
+        <w:pStyle w:val="PargrafodaLista"/>
+        <w:numPr>
+          <w:ilvl w:val="0"/>
+          <w:numId w:val="2"/>
+        </w:numPr>
+        <w:spacing w:after="0"/>
+        <w:rPr>
+          <w:rFonts w:ascii="Arial" w:hAnsi="Arial" w:cs="Arial"/>
+        </w:rPr>
+      </w:pPr>
+      <w:r>
+        <w:rPr>
+          <w:rFonts w:ascii="Arial" w:hAnsi="Arial" w:cs="Arial"/>
+          <w:b/>
+          <w:bCs/>
+        </w:rPr>
+        <w:t>Manutenção e Substituição de Peças:</w:t>
+      </w:r>
+      <w:r>
+        <w:rPr>
+          <w:rFonts w:ascii="Arial" w:hAnsi="Arial" w:cs="Arial"/>
+        </w:rPr>
+        <w:t xml:space="preserve"> Agiliza o processo de manutenção corretiva, garantindo a substituição por um componente idêntico ou equivalente sem risco de incompatibilidade elétrica ou física.</w:t>
+      </w:r>
+    </w:p>
+    <w:p>
+      <w:pPr>
+        <w:pStyle w:val="PargrafodaLista"/>
+        <w:rPr>
+          <w:rFonts w:ascii="Arial" w:hAnsi="Arial" w:cs="Arial"/>
+        </w:rPr>
+      </w:pPr>
+    </w:p>
+    <w:p>
+      <w:pPr>
+        <w:pStyle w:val="PargrafodaLista"/>
+        <w:numPr>
+          <w:ilvl w:val="0"/>
+          <w:numId w:val="2"/>
+        </w:numPr>
+        <w:spacing w:after="0"/>
+        <w:rPr>
+          <w:rFonts w:ascii="Arial" w:hAnsi="Arial" w:cs="Arial"/>
+        </w:rPr>
+      </w:pPr>
+      <w:r>
+        <w:rPr>
+          <w:rFonts w:ascii="Arial" w:hAnsi="Arial" w:cs="Arial"/>
+          <w:b/>
+          <w:bCs/>
+        </w:rPr>
+        <w:t>Instalação Segura em Áreas Classificadas:</w:t>
+      </w:r>
+      <w:r>
+        <w:rPr>
+          <w:rFonts w:ascii="Arial" w:hAnsi="Arial" w:cs="Arial"/>
+        </w:rPr>
+        <w:t xml:space="preserve"> Informa as normas e selos de proteção contra explosão e interferência eletromagnética (como ATEX, UL e CE), garantindo que o CLP atenda aos requisitos do ambiente fabril em que será aplicado.</w:t>
+      </w:r>
+    </w:p>
+    <w:p>
+      <w:pPr>
+        <w:spacing w:after="0"/>
+        <w:rPr>
+          <w:rFonts w:ascii="Arial" w:hAnsi="Arial" w:cs="Arial"/>
+        </w:rPr>
+      </w:pPr>
     </w:p>
     <w:sectPr>
       <w:pgSz w:w="11906" w:h="16838"/>
@@ -2047,7 +2915,7 @@
 </file>
 
 <file path=word/numbering.xml><?xml version="1.0" encoding="utf-8"?>
-<w:numbering xmlns:wpc="http://schemas.microsoft.com/office/word/2010/wordprocessingCanvas" xmlns:cx="http://schemas.microsoft.com/office/drawing/2014/chartex" xmlns:cx1="http://schemas.microsoft.com/office/drawing/2015/9/8/chartex" xmlns:cx2="http://schemas.microsoft.com/office/drawing/2015/10/21/chartex" xmlns:cx3="http://schemas.microsoft.com/office/drawing/2016/5/9/chartex" xmlns:cx4="http://schemas.microsoft.com/office/drawing/2016/5/10/chartex" xmlns:cx5="http://schemas.microsoft.com/office/drawing/2016/5/11/chartex" xmlns:cx6="http://schemas.microsoft.com/office/drawing/2016/5/12/chartex" xmlns:cx7="http://schemas.microsoft.com/office/drawing/2016/5/13/chartex" xmlns:cx8="http://schemas.microsoft.com/office/drawing/2016/5/14/chartex" xmlns:mc="http://schemas.openxmlformats.org/markup-compatibility/2006" xmlns:aink="http://schemas.microsoft.com/office/drawing/2016/ink" xmlns:am3d="http://schemas.microsoft.com/office/drawing/2017/model3d" xmlns:o="urn:schemas-microsoft-com:office:office" xmlns:oel="http://schemas.microsoft.com/office/2019/extlst" xmlns:r="http://schemas.openxmlformats.org/officeDocument/2006/relationships" xmlns:m="http://schemas.openxmlformats.org/officeDocument/2006/math" xmlns:v="urn:schemas-microsoft-com:vml" xmlns:wp14="http://schemas.microsoft.com/office/word/2010/wordprocessingDrawing" xmlns:wp="http://schemas.openxmlformats.org/drawingml/2006/wordprocessingDrawing" xmlns:w10="urn:schemas-microsoft-com:office:word" xmlns:w="http://schemas.openxmlformats.org/wordprocessingml/2006/main" xmlns:w14="http://schemas.microsoft.com/office/word/2010/wordml" xmlns:w15="http://schemas.microsoft.com/office/word/2012/wordml" xmlns:w16cex="http://schemas.microsoft.com/office/word/2018/wordml/cex" xmlns:w16cid="http://schemas.microsoft.com/office/word/2016/wordml/cid" xmlns:w16="http://schemas.microsoft.com/office/word/2018/wordml" xmlns:w16du="http://schemas.microsoft.com/office/word/2023/wordml/word16du" xmlns:w16sdtdh="http://schemas.microsoft.com/office/word/2020/wordml/sdtdatahash" xmlns:w16sdtfl="http://schemas.microsoft.com/office/word/2024/wordml/sdtformatlock" xmlns:w16se="http://schemas.microsoft.com/office/word/2015/wordml/symex" xmlns:wpg="http://schemas.microsoft.com/office/word/2010/wordprocessingGroup" xmlns:wpi="http://schemas.microsoft.com/office/word/2010/wordprocessingInk" xmlns:wne="http://schemas.microsoft.com/office/word/2006/wordml" xmlns:wps="http://schemas.microsoft.com/office/word/2010/wordprocessingShape" mc:Ignorable="w14 w15 w16se w16cid w16 w16cex w16sdtdh w16sdtfl w16du wp14">
+<w:numbering xmlns:wpc="http://schemas.microsoft.com/office/word/2010/wordprocessingCanvas" xmlns:cx="http://schemas.microsoft.com/office/drawing/2014/chartex" xmlns:cx1="http://schemas.microsoft.com/office/drawing/2015/9/8/chartex" xmlns:cx2="http://schemas.microsoft.com/office/drawing/2015/10/21/chartex" xmlns:cx3="http://schemas.microsoft.com/office/drawing/2016/5/9/chartex" xmlns:cx4="http://schemas.microsoft.com/office/drawing/2016/5/10/chartex" xmlns:cx5="http://schemas.microsoft.com/office/drawing/2016/5/11/chartex" xmlns:cx6="http://schemas.microsoft.com/office/drawing/2016/5/12/chartex" xmlns:cx7="http://schemas.microsoft.com/office/drawing/2016/5/13/chartex" xmlns:cx8="http://schemas.microsoft.com/office/drawing/2016/5/14/chartex" xmlns:mc="http://schemas.openxmlformats.org/markup-compatibility/2006" xmlns:aink="http://schemas.microsoft.com/office/drawing/2016/ink" xmlns:am3d="http://schemas.microsoft.com/office/drawing/2017/model3d" xmlns:o="urn:schemas-microsoft-com:office:office" xmlns:oel="http://schemas.microsoft.com/office/2019/extlst" xmlns:r="http://schemas.openxmlformats.org/officeDocument/2006/relationships" xmlns:m="http://schemas.openxmlformats.org/officeDocument/2006/math" xmlns:v="urn:schemas-microsoft-com:vml" xmlns:wp14="http://schemas.microsoft.com/office/word/2010/wordprocessingDrawing" xmlns:wp="http://schemas.openxmlformats.org/drawingml/2006/wordprocessingDrawing" xmlns:w10="urn:schemas-microsoft-com:office:word" xmlns:w="http://schemas.openxmlformats.org/wordprocessingml/2006/main" xmlns:w14="http://schemas.microsoft.com/office/word/2010/wordml" xmlns:w15="http://schemas.microsoft.com/office/word/2012/wordml" xmlns:w16cex="http://schemas.microsoft.com/office/word/2018/wordml/cex" xmlns:w16cid="http://schemas.microsoft.com/office/word/2016/wordml/cid" xmlns:w16="http://schemas.microsoft.com/office/word/2018/wordml" xmlns:w16sdtdh="http://schemas.microsoft.com/office/word/2020/wordml/sdtdatahash" xmlns:w16se="http://schemas.microsoft.com/office/word/2015/wordml/symex" xmlns:wpg="http://schemas.microsoft.com/office/word/2010/wordprocessingGroup" xmlns:wpi="http://schemas.microsoft.com/office/word/2010/wordprocessingInk" xmlns:wne="http://schemas.microsoft.com/office/word/2006/wordml" xmlns:wps="http://schemas.microsoft.com/office/word/2010/wordprocessingShape" mc:Ignorable="w14 w15 w16se w16cid w16 w16cex w16sdtdh wp14">
   <w:abstractNum w:abstractNumId="0" w15:restartNumberingAfterBreak="0">
     <w:nsid w:val="088466F8"/>
     <w:multiLevelType w:val="hybridMultilevel"/>
@@ -2388,6 +3256,119 @@
     </w:lvl>
   </w:abstractNum>
   <w:abstractNum w:abstractNumId="3" w15:restartNumberingAfterBreak="0">
+    <w:nsid w:val="440834E2"/>
+    <w:multiLevelType w:val="hybridMultilevel"/>
+    <w:tmpl w:val="FF8C5A88"/>
+    <w:lvl w:ilvl="0" w:tplc="04160001">
+      <w:start w:val="1"/>
+      <w:numFmt w:val="bullet"/>
+      <w:lvlText w:val=""/>
+      <w:lvlJc w:val="left"/>
+      <w:pPr>
+        <w:ind w:left="720" w:hanging="360"/>
+      </w:pPr>
+      <w:rPr>
+        <w:rFonts w:ascii="Symbol" w:hAnsi="Symbol" w:hint="default"/>
+      </w:rPr>
+    </w:lvl>
+    <w:lvl w:ilvl="1" w:tplc="04160003" w:tentative="1">
+      <w:start w:val="1"/>
+      <w:numFmt w:val="bullet"/>
+      <w:lvlText w:val="o"/>
+      <w:lvlJc w:val="left"/>
+      <w:pPr>
+        <w:ind w:left="1440" w:hanging="360"/>
+      </w:pPr>
+      <w:rPr>
+        <w:rFonts w:ascii="Courier New" w:hAnsi="Courier New" w:cs="Courier New" w:hint="default"/>
+      </w:rPr>
+    </w:lvl>
+    <w:lvl w:ilvl="2" w:tplc="04160005" w:tentative="1">
+      <w:start w:val="1"/>
+      <w:numFmt w:val="bullet"/>
+      <w:lvlText w:val=""/>
+      <w:lvlJc w:val="left"/>
+      <w:pPr>
+        <w:ind w:left="2160" w:hanging="360"/>
+      </w:pPr>
+      <w:rPr>
+        <w:rFonts w:ascii="Wingdings" w:hAnsi="Wingdings" w:hint="default"/>
+      </w:rPr>
+    </w:lvl>
+    <w:lvl w:ilvl="3" w:tplc="04160001" w:tentative="1">
+      <w:start w:val="1"/>
+      <w:numFmt w:val="bullet"/>
+      <w:lvlText w:val=""/>
+      <w:lvlJc w:val="left"/>
+      <w:pPr>
+        <w:ind w:left="2880" w:hanging="360"/>
+      </w:pPr>
+      <w:rPr>
+        <w:rFonts w:ascii="Symbol" w:hAnsi="Symbol" w:hint="default"/>
+      </w:rPr>
+    </w:lvl>
+    <w:lvl w:ilvl="4" w:tplc="04160003" w:tentative="1">
+      <w:start w:val="1"/>
+      <w:numFmt w:val="bullet"/>
+      <w:lvlText w:val="o"/>
+      <w:lvlJc w:val="left"/>
+      <w:pPr>
+        <w:ind w:left="3600" w:hanging="360"/>
+      </w:pPr>
+      <w:rPr>
+        <w:rFonts w:ascii="Courier New" w:hAnsi="Courier New" w:cs="Courier New" w:hint="default"/>
+      </w:rPr>
+    </w:lvl>
+    <w:lvl w:ilvl="5" w:tplc="04160005" w:tentative="1">
+      <w:start w:val="1"/>
+      <w:numFmt w:val="bullet"/>
+      <w:lvlText w:val=""/>
+      <w:lvlJc w:val="left"/>
+      <w:pPr>
+        <w:ind w:left="4320" w:hanging="360"/>
+      </w:pPr>
+      <w:rPr>
+        <w:rFonts w:ascii="Wingdings" w:hAnsi="Wingdings" w:hint="default"/>
+      </w:rPr>
+    </w:lvl>
+    <w:lvl w:ilvl="6" w:tplc="04160001" w:tentative="1">
+      <w:start w:val="1"/>
+      <w:numFmt w:val="bullet"/>
+      <w:lvlText w:val=""/>
+      <w:lvlJc w:val="left"/>
+      <w:pPr>
+        <w:ind w:left="5040" w:hanging="360"/>
+      </w:pPr>
+      <w:rPr>
+        <w:rFonts w:ascii="Symbol" w:hAnsi="Symbol" w:hint="default"/>
+      </w:rPr>
+    </w:lvl>
+    <w:lvl w:ilvl="7" w:tplc="04160003" w:tentative="1">
+      <w:start w:val="1"/>
+      <w:numFmt w:val="bullet"/>
+      <w:lvlText w:val="o"/>
+      <w:lvlJc w:val="left"/>
+      <w:pPr>
+        <w:ind w:left="5760" w:hanging="360"/>
+      </w:pPr>
+      <w:rPr>
+        <w:rFonts w:ascii="Courier New" w:hAnsi="Courier New" w:cs="Courier New" w:hint="default"/>
+      </w:rPr>
+    </w:lvl>
+    <w:lvl w:ilvl="8" w:tplc="04160005" w:tentative="1">
+      <w:start w:val="1"/>
+      <w:numFmt w:val="bullet"/>
+      <w:lvlText w:val=""/>
+      <w:lvlJc w:val="left"/>
+      <w:pPr>
+        <w:ind w:left="6480" w:hanging="360"/>
+      </w:pPr>
+      <w:rPr>
+        <w:rFonts w:ascii="Wingdings" w:hAnsi="Wingdings" w:hint="default"/>
+      </w:rPr>
+    </w:lvl>
+  </w:abstractNum>
+  <w:abstractNum w:abstractNumId="4" w15:restartNumberingAfterBreak="0">
     <w:nsid w:val="468E77C8"/>
     <w:multiLevelType w:val="hybridMultilevel"/>
     <w:tmpl w:val="1DF22180"/>
@@ -2500,7 +3481,7 @@
       </w:rPr>
     </w:lvl>
   </w:abstractNum>
-  <w:abstractNum w:abstractNumId="4" w15:restartNumberingAfterBreak="0">
+  <w:abstractNum w:abstractNumId="5" w15:restartNumberingAfterBreak="0">
     <w:nsid w:val="516A1810"/>
     <w:multiLevelType w:val="hybridMultilevel"/>
     <w:tmpl w:val="8C44A456"/>
@@ -2613,7 +3594,7 @@
       </w:rPr>
     </w:lvl>
   </w:abstractNum>
-  <w:abstractNum w:abstractNumId="5" w15:restartNumberingAfterBreak="0">
+  <w:abstractNum w:abstractNumId="6" w15:restartNumberingAfterBreak="0">
     <w:nsid w:val="531B7F46"/>
     <w:multiLevelType w:val="hybridMultilevel"/>
     <w:tmpl w:val="0568D204"/>
@@ -2726,7 +3707,7 @@
       </w:rPr>
     </w:lvl>
   </w:abstractNum>
-  <w:abstractNum w:abstractNumId="6" w15:restartNumberingAfterBreak="0">
+  <w:abstractNum w:abstractNumId="7" w15:restartNumberingAfterBreak="0">
     <w:nsid w:val="5BAD375A"/>
     <w:multiLevelType w:val="hybridMultilevel"/>
     <w:tmpl w:val="4BA43D46"/>
@@ -2839,7 +3820,7 @@
       </w:rPr>
     </w:lvl>
   </w:abstractNum>
-  <w:abstractNum w:abstractNumId="7" w15:restartNumberingAfterBreak="0">
+  <w:abstractNum w:abstractNumId="8" w15:restartNumberingAfterBreak="0">
     <w:nsid w:val="649902EF"/>
     <w:multiLevelType w:val="hybridMultilevel"/>
     <w:tmpl w:val="93BE7E66"/>
@@ -2952,7 +3933,7 @@
       </w:rPr>
     </w:lvl>
   </w:abstractNum>
-  <w:abstractNum w:abstractNumId="8" w15:restartNumberingAfterBreak="0">
+  <w:abstractNum w:abstractNumId="9" w15:restartNumberingAfterBreak="0">
     <w:nsid w:val="67D769F7"/>
     <w:multiLevelType w:val="hybridMultilevel"/>
     <w:tmpl w:val="B5480C9A"/>
@@ -3065,7 +4046,7 @@
       </w:rPr>
     </w:lvl>
   </w:abstractNum>
-  <w:abstractNum w:abstractNumId="9" w15:restartNumberingAfterBreak="0">
+  <w:abstractNum w:abstractNumId="10" w15:restartNumberingAfterBreak="0">
     <w:nsid w:val="6BF970BA"/>
     <w:multiLevelType w:val="hybridMultilevel"/>
     <w:tmpl w:val="E01AECD0"/>
@@ -3178,7 +4159,7 @@
       </w:rPr>
     </w:lvl>
   </w:abstractNum>
-  <w:abstractNum w:abstractNumId="10" w15:restartNumberingAfterBreak="0">
+  <w:abstractNum w:abstractNumId="11" w15:restartNumberingAfterBreak="0">
     <w:nsid w:val="748E3170"/>
     <w:multiLevelType w:val="hybridMultilevel"/>
     <w:tmpl w:val="A55EAED2"/>
@@ -3292,22 +4273,22 @@
     </w:lvl>
   </w:abstractNum>
   <w:num w:numId="1" w16cid:durableId="1247156490">
+    <w:abstractNumId w:val="5"/>
+  </w:num>
+  <w:num w:numId="2" w16cid:durableId="2084719303">
+    <w:abstractNumId w:val="9"/>
+  </w:num>
+  <w:num w:numId="3" w16cid:durableId="1813867175">
     <w:abstractNumId w:val="4"/>
   </w:num>
-  <w:num w:numId="2" w16cid:durableId="2084719303">
-    <w:abstractNumId w:val="8"/>
-  </w:num>
-  <w:num w:numId="3" w16cid:durableId="1813867175">
-    <w:abstractNumId w:val="3"/>
-  </w:num>
   <w:num w:numId="4" w16cid:durableId="513032598">
-    <w:abstractNumId w:val="9"/>
+    <w:abstractNumId w:val="10"/>
   </w:num>
   <w:num w:numId="5" w16cid:durableId="140932187">
     <w:abstractNumId w:val="0"/>
   </w:num>
   <w:num w:numId="6" w16cid:durableId="1638801061">
-    <w:abstractNumId w:val="7"/>
+    <w:abstractNumId w:val="8"/>
   </w:num>
   <w:num w:numId="7" w16cid:durableId="2001036425">
     <w:abstractNumId w:val="1"/>
@@ -3316,19 +4297,22 @@
     <w:abstractNumId w:val="2"/>
   </w:num>
   <w:num w:numId="9" w16cid:durableId="1972977360">
-    <w:abstractNumId w:val="10"/>
+    <w:abstractNumId w:val="11"/>
   </w:num>
   <w:num w:numId="10" w16cid:durableId="1922635332">
-    <w:abstractNumId w:val="5"/>
+    <w:abstractNumId w:val="6"/>
   </w:num>
   <w:num w:numId="11" w16cid:durableId="343829836">
-    <w:abstractNumId w:val="6"/>
+    <w:abstractNumId w:val="7"/>
+  </w:num>
+  <w:num w:numId="12" w16cid:durableId="135690082">
+    <w:abstractNumId w:val="3"/>
   </w:num>
 </w:numbering>
 </file>
 
 <file path=word/styles.xml><?xml version="1.0" encoding="utf-8"?>
-<w:styles xmlns:mc="http://schemas.openxmlformats.org/markup-compatibility/2006" xmlns:r="http://schemas.openxmlformats.org/officeDocument/2006/relationships" xmlns:w="http://schemas.openxmlformats.org/wordprocessingml/2006/main" xmlns:w14="http://schemas.microsoft.com/office/word/2010/wordml" xmlns:w15="http://schemas.microsoft.com/office/word/2012/wordml" xmlns:w16cex="http://schemas.microsoft.com/office/word/2018/wordml/cex" xmlns:w16cid="http://schemas.microsoft.com/office/word/2016/wordml/cid" xmlns:w16="http://schemas.microsoft.com/office/word/2018/wordml" xmlns:w16du="http://schemas.microsoft.com/office/word/2023/wordml/word16du" xmlns:w16sdtdh="http://schemas.microsoft.com/office/word/2020/wordml/sdtdatahash" xmlns:w16sdtfl="http://schemas.microsoft.com/office/word/2024/wordml/sdtformatlock" xmlns:w16se="http://schemas.microsoft.com/office/word/2015/wordml/symex" mc:Ignorable="w14 w15 w16se w16cid w16 w16cex w16sdtdh w16sdtfl w16du">
+<w:styles xmlns:mc="http://schemas.openxmlformats.org/markup-compatibility/2006" xmlns:r="http://schemas.openxmlformats.org/officeDocument/2006/relationships" xmlns:w="http://schemas.openxmlformats.org/wordprocessingml/2006/main" xmlns:w14="http://schemas.microsoft.com/office/word/2010/wordml" xmlns:w15="http://schemas.microsoft.com/office/word/2012/wordml" xmlns:w16cex="http://schemas.microsoft.com/office/word/2018/wordml/cex" xmlns:w16cid="http://schemas.microsoft.com/office/word/2016/wordml/cid" xmlns:w16="http://schemas.microsoft.com/office/word/2018/wordml" xmlns:w16sdtdh="http://schemas.microsoft.com/office/word/2020/wordml/sdtdatahash" xmlns:w16se="http://schemas.microsoft.com/office/word/2015/wordml/symex" mc:Ignorable="w14 w15 w16se w16cid w16 w16cex w16sdtdh">
   <w:docDefaults>
     <w:rPrDefault>
       <w:rPr>
@@ -3755,7 +4739,6 @@
     <w:next w:val="Normal"/>
     <w:link w:val="Ttulo2Char"/>
     <w:uiPriority w:val="9"/>
-    <w:semiHidden/>
     <w:unhideWhenUsed/>
     <w:qFormat/>
     <w:rsid w:val="00732722"/>
@@ -3778,7 +4761,6 @@
     <w:next w:val="Normal"/>
     <w:link w:val="Ttulo3Char"/>
     <w:uiPriority w:val="9"/>
-    <w:semiHidden/>
     <w:unhideWhenUsed/>
     <w:qFormat/>
     <w:rsid w:val="00732722"/>
@@ -3930,7 +4912,6 @@
   <w:style w:type="character" w:default="1" w:styleId="Fontepargpadro">
     <w:name w:val="Default Paragraph Font"/>
     <w:uiPriority w:val="1"/>
-    <w:semiHidden/>
     <w:unhideWhenUsed/>
   </w:style>
   <w:style w:type="table" w:default="1" w:styleId="Tabelanormal">
@@ -3972,7 +4953,6 @@
     <w:basedOn w:val="Fontepargpadro"/>
     <w:link w:val="Ttulo2"/>
     <w:uiPriority w:val="9"/>
-    <w:semiHidden/>
     <w:rsid w:val="00732722"/>
     <w:rPr>
       <w:rFonts w:asciiTheme="majorHAnsi" w:eastAsiaTheme="majorEastAsia" w:hAnsiTheme="majorHAnsi" w:cstheme="majorBidi"/>
@@ -3986,7 +4966,6 @@
     <w:basedOn w:val="Fontepargpadro"/>
     <w:link w:val="Ttulo3"/>
     <w:uiPriority w:val="9"/>
-    <w:semiHidden/>
     <w:rsid w:val="00732722"/>
     <w:rPr>
       <w:rFonts w:eastAsiaTheme="majorEastAsia" w:cstheme="majorBidi"/>
@@ -4242,6 +5221,17 @@
       <w:smallCaps/>
       <w:color w:val="2F5496" w:themeColor="accent1" w:themeShade="BF"/>
       <w:spacing w:val="5"/>
+    </w:rPr>
+  </w:style>
+  <w:style w:type="paragraph" w:styleId="NormalWeb">
+    <w:name w:val="Normal (Web)"/>
+    <w:basedOn w:val="Normal"/>
+    <w:uiPriority w:val="99"/>
+    <w:semiHidden/>
+    <w:unhideWhenUsed/>
+    <w:rsid w:val="00404398"/>
+    <w:rPr>
+      <w:rFonts w:ascii="Times New Roman" w:hAnsi="Times New Roman" w:cs="Times New Roman"/>
     </w:rPr>
   </w:style>
 </w:styles>

</xml_diff>